<commit_message>
Todas las expansiones añadidas
</commit_message>
<xml_diff>
--- a/SEV_Nave.docx
+++ b/SEV_Nave.docx
@@ -2,181 +2,3524 @@
 <file path=word/document.xml><?xml version="1.0" encoding="utf-8"?>
 <w:document xmlns:wpc="http://schemas.microsoft.com/office/word/2010/wordprocessingCanvas" xmlns:cx="http://schemas.microsoft.com/office/drawing/2014/chartex" xmlns:cx1="http://schemas.microsoft.com/office/drawing/2015/9/8/chartex" xmlns:cx2="http://schemas.microsoft.com/office/drawing/2015/10/21/chartex" xmlns:cx3="http://schemas.microsoft.com/office/drawing/2016/5/9/chartex" xmlns:cx4="http://schemas.microsoft.com/office/drawing/2016/5/10/chartex" xmlns:cx5="http://schemas.microsoft.com/office/drawing/2016/5/11/chartex" xmlns:cx6="http://schemas.microsoft.com/office/drawing/2016/5/12/chartex" xmlns:cx7="http://schemas.microsoft.com/office/drawing/2016/5/13/chartex" xmlns:cx8="http://schemas.microsoft.com/office/drawing/2016/5/14/chartex" xmlns:mc="http://schemas.openxmlformats.org/markup-compatibility/2006" xmlns:aink="http://schemas.microsoft.com/office/drawing/2016/ink" xmlns:am3d="http://schemas.microsoft.com/office/drawing/2017/model3d" xmlns:o="urn:schemas-microsoft-com:office:office" xmlns:oel="http://schemas.microsoft.com/office/2019/extlst" xmlns:r="http://schemas.openxmlformats.org/officeDocument/2006/relationships" xmlns:m="http://schemas.openxmlformats.org/officeDocument/2006/math" xmlns:v="urn:schemas-microsoft-com:vml" xmlns:wp14="http://schemas.microsoft.com/office/word/2010/wordprocessingDrawing" xmlns:wp="http://schemas.openxmlformats.org/drawingml/2006/wordprocessingDrawing" xmlns:w10="urn:schemas-microsoft-com:office:word" xmlns:w="http://schemas.openxmlformats.org/wordprocessingml/2006/main" xmlns:w14="http://schemas.microsoft.com/office/word/2010/wordml" xmlns:w15="http://schemas.microsoft.com/office/word/2012/wordml" xmlns:w16cex="http://schemas.microsoft.com/office/word/2018/wordml/cex" xmlns:w16cid="http://schemas.microsoft.com/office/word/2016/wordml/cid" xmlns:w16="http://schemas.microsoft.com/office/word/2018/wordml" xmlns:w16du="http://schemas.microsoft.com/office/word/2023/wordml/word16du" xmlns:w16sdtdh="http://schemas.microsoft.com/office/word/2020/wordml/sdtdatahash" xmlns:w16sdtfl="http://schemas.microsoft.com/office/word/2024/wordml/sdtformatlock" xmlns:w16se="http://schemas.microsoft.com/office/word/2015/wordml/symex" xmlns:wpg="http://schemas.microsoft.com/office/word/2010/wordprocessingGroup" xmlns:wpi="http://schemas.microsoft.com/office/word/2010/wordprocessingInk" xmlns:wne="http://schemas.microsoft.com/office/word/2006/wordml" xmlns:wps="http://schemas.microsoft.com/office/word/2010/wordprocessingShape" mc:Ignorable="w14 w15 w16se w16cid w16 w16cex w16sdtdh w16sdtfl w16du wp14">
   <w:body>
+    <w:sdt>
+      <w:sdtPr>
+        <w:id w:val="1725555592"/>
+        <w:docPartObj>
+          <w:docPartGallery w:val="Cover Pages"/>
+          <w:docPartUnique/>
+        </w:docPartObj>
+      </w:sdtPr>
+      <w:sdtContent>
+        <w:p>
+          <w:r>
+            <w:rPr>
+              <w:noProof/>
+            </w:rPr>
+            <mc:AlternateContent>
+              <mc:Choice Requires="wpg">
+                <w:drawing>
+                  <wp:anchor distT="0" distB="0" distL="114300" distR="114300" simplePos="0" relativeHeight="251659264" behindDoc="0" locked="0" layoutInCell="1" allowOverlap="1" wp14:anchorId="5C0482D1" wp14:editId="18192087">
+                    <wp:simplePos x="0" y="0"/>
+                    <wp:positionH relativeFrom="page">
+                      <wp:align>right</wp:align>
+                    </wp:positionH>
+                    <wp:positionV relativeFrom="page">
+                      <wp:align>top</wp:align>
+                    </wp:positionV>
+                    <wp:extent cx="3113670" cy="10058400"/>
+                    <wp:effectExtent l="0" t="0" r="5080" b="0"/>
+                    <wp:wrapNone/>
+                    <wp:docPr id="453" name="Grupo 252"/>
+                    <wp:cNvGraphicFramePr/>
+                    <a:graphic xmlns:a="http://schemas.openxmlformats.org/drawingml/2006/main">
+                      <a:graphicData uri="http://schemas.microsoft.com/office/word/2010/wordprocessingGroup">
+                        <wpg:wgp>
+                          <wpg:cNvGrpSpPr/>
+                          <wpg:grpSpPr>
+                            <a:xfrm>
+                              <a:off x="0" y="0"/>
+                              <a:ext cx="3113670" cy="10058400"/>
+                              <a:chOff x="0" y="0"/>
+                              <a:chExt cx="3113670" cy="10058400"/>
+                            </a:xfrm>
+                          </wpg:grpSpPr>
+                          <wps:wsp>
+                            <wps:cNvPr id="459" name="Rectángulo 459" descr="Light vertical"/>
+                            <wps:cNvSpPr>
+                              <a:spLocks noChangeArrowheads="1"/>
+                            </wps:cNvSpPr>
+                            <wps:spPr bwMode="auto">
+                              <a:xfrm>
+                                <a:off x="0" y="0"/>
+                                <a:ext cx="138545" cy="10058400"/>
+                              </a:xfrm>
+                              <a:prstGeom prst="rect">
+                                <a:avLst/>
+                              </a:prstGeom>
+                              <a:pattFill prst="dkVert">
+                                <a:fgClr>
+                                  <a:schemeClr val="accent6">
+                                    <a:lumMod val="60000"/>
+                                    <a:lumOff val="40000"/>
+                                    <a:alpha val="80000"/>
+                                  </a:schemeClr>
+                                </a:fgClr>
+                                <a:bgClr>
+                                  <a:schemeClr val="bg1">
+                                    <a:alpha val="80000"/>
+                                  </a:schemeClr>
+                                </a:bgClr>
+                              </a:pattFill>
+                              <a:extLst>
+                                <a:ext uri="{91240B29-F687-4F45-9708-019B960494DF}">
+                                  <a14:hiddenLine xmlns:a14="http://schemas.microsoft.com/office/drawing/2010/main" w="12700">
+                                    <a:solidFill>
+                                      <a:srgbClr val="FFFFFF"/>
+                                    </a:solidFill>
+                                    <a:miter lim="800000"/>
+                                    <a:headEnd/>
+                                    <a:tailEnd/>
+                                  </a14:hiddenLine>
+                                </a:ext>
+                                <a:ext uri="{AF507438-7753-43E0-B8FC-AC1667EBCBE1}">
+                                  <a14:hiddenEffects xmlns:a14="http://schemas.microsoft.com/office/drawing/2010/main">
+                                    <a:effectLst>
+                                      <a:outerShdw dist="53882" dir="2700000" algn="ctr" rotWithShape="0">
+                                        <a:srgbClr val="D8D8D8"/>
+                                      </a:outerShdw>
+                                    </a:effectLst>
+                                  </a14:hiddenEffects>
+                                </a:ext>
+                              </a:extLst>
+                            </wps:spPr>
+                            <wps:bodyPr rot="0" vert="horz" wrap="square" lIns="91440" tIns="45720" rIns="91440" bIns="45720" anchor="ctr" anchorCtr="0" upright="1">
+                              <a:noAutofit/>
+                            </wps:bodyPr>
+                          </wps:wsp>
+                          <wps:wsp>
+                            <wps:cNvPr id="460" name="Rectángulo 460"/>
+                            <wps:cNvSpPr>
+                              <a:spLocks noChangeArrowheads="1"/>
+                            </wps:cNvSpPr>
+                            <wps:spPr bwMode="auto">
+                              <a:xfrm>
+                                <a:off x="124691" y="0"/>
+                                <a:ext cx="2971800" cy="10058400"/>
+                              </a:xfrm>
+                              <a:prstGeom prst="rect">
+                                <a:avLst/>
+                              </a:prstGeom>
+                              <a:solidFill>
+                                <a:schemeClr val="accent4">
+                                  <a:lumMod val="40000"/>
+                                  <a:lumOff val="60000"/>
+                                </a:schemeClr>
+                              </a:solidFill>
+                              <a:extLst>
+                                <a:ext uri="{91240B29-F687-4F45-9708-019B960494DF}">
+                                  <a14:hiddenLine xmlns:a14="http://schemas.microsoft.com/office/drawing/2010/main" w="9525">
+                                    <a:solidFill>
+                                      <a:srgbClr val="D8D8D8"/>
+                                    </a:solidFill>
+                                    <a:miter lim="800000"/>
+                                    <a:headEnd/>
+                                    <a:tailEnd/>
+                                  </a14:hiddenLine>
+                                </a:ext>
+                              </a:extLst>
+                            </wps:spPr>
+                            <wps:bodyPr rot="0" vert="horz" wrap="square" lIns="91440" tIns="45720" rIns="91440" bIns="45720" anchor="t" anchorCtr="0" upright="1">
+                              <a:noAutofit/>
+                            </wps:bodyPr>
+                          </wps:wsp>
+                          <wps:wsp>
+                            <wps:cNvPr id="461" name="Rectángulo 461"/>
+                            <wps:cNvSpPr>
+                              <a:spLocks noChangeArrowheads="1"/>
+                            </wps:cNvSpPr>
+                            <wps:spPr bwMode="auto">
+                              <a:xfrm>
+                                <a:off x="13854" y="0"/>
+                                <a:ext cx="3099816" cy="2377440"/>
+                              </a:xfrm>
+                              <a:prstGeom prst="rect">
+                                <a:avLst/>
+                              </a:prstGeom>
+                              <a:noFill/>
+                              <a:extLst>
+                                <a:ext uri="{909E8E84-426E-40DD-AFC4-6F175D3DCCD1}">
+                                  <a14:hiddenFill xmlns:a14="http://schemas.microsoft.com/office/drawing/2010/main">
+                                    <a:solidFill>
+                                      <a:srgbClr val="FFFFFF">
+                                        <a:alpha val="80000"/>
+                                      </a:srgbClr>
+                                    </a:solidFill>
+                                  </a14:hiddenFill>
+                                </a:ext>
+                                <a:ext uri="{91240B29-F687-4F45-9708-019B960494DF}">
+                                  <a14:hiddenLine xmlns:a14="http://schemas.microsoft.com/office/drawing/2010/main" w="12700">
+                                    <a:solidFill>
+                                      <a:srgbClr val="FFFFFF"/>
+                                    </a:solidFill>
+                                    <a:miter lim="800000"/>
+                                    <a:headEnd/>
+                                    <a:tailEnd/>
+                                  </a14:hiddenLine>
+                                </a:ext>
+                                <a:ext uri="{AF507438-7753-43E0-B8FC-AC1667EBCBE1}">
+                                  <a14:hiddenEffects xmlns:a14="http://schemas.microsoft.com/office/drawing/2010/main">
+                                    <a:effectLst>
+                                      <a:outerShdw dist="53882" dir="2700000" algn="ctr" rotWithShape="0">
+                                        <a:srgbClr val="D8D8D8"/>
+                                      </a:outerShdw>
+                                    </a:effectLst>
+                                  </a14:hiddenEffects>
+                                </a:ext>
+                              </a:extLst>
+                            </wps:spPr>
+                            <wps:txbx>
+                              <w:txbxContent>
+                                <w:sdt>
+                                  <w:sdtPr>
+                                    <w:rPr>
+                                      <w:color w:val="FFFFFF" w:themeColor="background1"/>
+                                      <w:sz w:val="96"/>
+                                      <w:szCs w:val="96"/>
+                                    </w:rPr>
+                                    <w:alias w:val="Año"/>
+                                    <w:id w:val="1012341074"/>
+                                    <w:dataBinding w:prefixMappings="xmlns:ns0='http://schemas.microsoft.com/office/2006/coverPageProps'" w:xpath="/ns0:CoverPageProperties[1]/ns0:PublishDate[1]" w:storeItemID="{55AF091B-3C7A-41E3-B477-F2FDAA23CFDA}"/>
+                                    <w:date w:fullDate="2026-09-24T00:00:00Z">
+                                      <w:dateFormat w:val="yyyy"/>
+                                      <w:lid w:val="es-ES"/>
+                                      <w:storeMappedDataAs w:val="dateTime"/>
+                                      <w:calendar w:val="gregorian"/>
+                                    </w:date>
+                                  </w:sdtPr>
+                                  <w:sdtContent>
+                                    <w:p>
+                                      <w:pPr>
+                                        <w:pStyle w:val="Sinespaciado"/>
+                                        <w:rPr>
+                                          <w:color w:val="FFFFFF" w:themeColor="background1"/>
+                                          <w:sz w:val="96"/>
+                                          <w:szCs w:val="96"/>
+                                        </w:rPr>
+                                      </w:pPr>
+                                      <w:r>
+                                        <w:rPr>
+                                          <w:color w:val="FFFFFF" w:themeColor="background1"/>
+                                          <w:sz w:val="96"/>
+                                          <w:szCs w:val="96"/>
+                                        </w:rPr>
+                                        <w:t>2026</w:t>
+                                      </w:r>
+                                    </w:p>
+                                  </w:sdtContent>
+                                </w:sdt>
+                              </w:txbxContent>
+                            </wps:txbx>
+                            <wps:bodyPr rot="0" vert="horz" wrap="square" lIns="365760" tIns="182880" rIns="182880" bIns="182880" anchor="b" anchorCtr="0" upright="1">
+                              <a:noAutofit/>
+                            </wps:bodyPr>
+                          </wps:wsp>
+                          <wps:wsp>
+                            <wps:cNvPr id="462" name="Rectángulo 9"/>
+                            <wps:cNvSpPr>
+                              <a:spLocks noChangeArrowheads="1"/>
+                            </wps:cNvSpPr>
+                            <wps:spPr bwMode="auto">
+                              <a:xfrm>
+                                <a:off x="0" y="6761018"/>
+                                <a:ext cx="3089515" cy="2833370"/>
+                              </a:xfrm>
+                              <a:prstGeom prst="rect">
+                                <a:avLst/>
+                              </a:prstGeom>
+                              <a:noFill/>
+                              <a:extLst>
+                                <a:ext uri="{909E8E84-426E-40DD-AFC4-6F175D3DCCD1}">
+                                  <a14:hiddenFill xmlns:a14="http://schemas.microsoft.com/office/drawing/2010/main">
+                                    <a:solidFill>
+                                      <a:srgbClr val="FFFFFF">
+                                        <a:alpha val="80000"/>
+                                      </a:srgbClr>
+                                    </a:solidFill>
+                                  </a14:hiddenFill>
+                                </a:ext>
+                                <a:ext uri="{91240B29-F687-4F45-9708-019B960494DF}">
+                                  <a14:hiddenLine xmlns:a14="http://schemas.microsoft.com/office/drawing/2010/main" w="12700">
+                                    <a:solidFill>
+                                      <a:srgbClr val="FFFFFF"/>
+                                    </a:solidFill>
+                                    <a:miter lim="800000"/>
+                                    <a:headEnd/>
+                                    <a:tailEnd/>
+                                  </a14:hiddenLine>
+                                </a:ext>
+                                <a:ext uri="{AF507438-7753-43E0-B8FC-AC1667EBCBE1}">
+                                  <a14:hiddenEffects xmlns:a14="http://schemas.microsoft.com/office/drawing/2010/main">
+                                    <a:effectLst>
+                                      <a:outerShdw dist="53882" dir="2700000" algn="ctr" rotWithShape="0">
+                                        <a:srgbClr val="D8D8D8"/>
+                                      </a:outerShdw>
+                                    </a:effectLst>
+                                  </a14:hiddenEffects>
+                                </a:ext>
+                              </a:extLst>
+                            </wps:spPr>
+                            <wps:txbx>
+                              <w:txbxContent>
+                                <w:sdt>
+                                  <w:sdtPr>
+                                    <w:rPr>
+                                      <w:color w:val="FFFFFF" w:themeColor="background1"/>
+                                    </w:rPr>
+                                    <w:alias w:val="Autor"/>
+                                    <w:id w:val="1380359617"/>
+                                    <w:dataBinding w:prefixMappings="xmlns:ns0='http://schemas.openxmlformats.org/package/2006/metadata/core-properties' xmlns:ns1='http://purl.org/dc/elements/1.1/'" w:xpath="/ns0:coreProperties[1]/ns1:creator[1]" w:storeItemID="{6C3C8BC8-F283-45AE-878A-BAB7291924A1}"/>
+                                    <w:text/>
+                                  </w:sdtPr>
+                                  <w:sdtContent>
+                                    <w:p>
+                                      <w:pPr>
+                                        <w:pStyle w:val="Sinespaciado"/>
+                                        <w:spacing w:line="360" w:lineRule="auto"/>
+                                        <w:rPr>
+                                          <w:color w:val="FFFFFF" w:themeColor="background1"/>
+                                        </w:rPr>
+                                      </w:pPr>
+                                      <w:r>
+                                        <w:rPr>
+                                          <w:color w:val="FFFFFF" w:themeColor="background1"/>
+                                        </w:rPr>
+                                        <w:t>Pablo Arias Fernández</w:t>
+                                      </w:r>
+                                    </w:p>
+                                  </w:sdtContent>
+                                </w:sdt>
+                                <w:sdt>
+                                  <w:sdtPr>
+                                    <w:rPr>
+                                      <w:color w:val="FFFFFF" w:themeColor="background1"/>
+                                    </w:rPr>
+                                    <w:alias w:val="Compañía"/>
+                                    <w:id w:val="1760174317"/>
+                                    <w:dataBinding w:prefixMappings="xmlns:ns0='http://schemas.openxmlformats.org/officeDocument/2006/extended-properties'" w:xpath="/ns0:Properties[1]/ns0:Company[1]" w:storeItemID="{6668398D-A668-4E3E-A5EB-62B293D839F1}"/>
+                                    <w:text/>
+                                  </w:sdtPr>
+                                  <w:sdtContent>
+                                    <w:p>
+                                      <w:pPr>
+                                        <w:pStyle w:val="Sinespaciado"/>
+                                        <w:spacing w:line="360" w:lineRule="auto"/>
+                                        <w:rPr>
+                                          <w:color w:val="FFFFFF" w:themeColor="background1"/>
+                                        </w:rPr>
+                                      </w:pPr>
+                                      <w:r>
+                                        <w:rPr>
+                                          <w:color w:val="FFFFFF" w:themeColor="background1"/>
+                                        </w:rPr>
+                                        <w:t>UO30305@UNIOVI.ES</w:t>
+                                      </w:r>
+                                    </w:p>
+                                  </w:sdtContent>
+                                </w:sdt>
+                                <w:sdt>
+                                  <w:sdtPr>
+                                    <w:rPr>
+                                      <w:color w:val="FFFFFF" w:themeColor="background1"/>
+                                    </w:rPr>
+                                    <w:alias w:val="Fecha"/>
+                                    <w:id w:val="1724480474"/>
+                                    <w:dataBinding w:prefixMappings="xmlns:ns0='http://schemas.microsoft.com/office/2006/coverPageProps'" w:xpath="/ns0:CoverPageProperties[1]/ns0:PublishDate[1]" w:storeItemID="{55AF091B-3C7A-41E3-B477-F2FDAA23CFDA}"/>
+                                    <w:date w:fullDate="2026-09-24T00:00:00Z">
+                                      <w:dateFormat w:val="d-M-yyyy"/>
+                                      <w:lid w:val="es-ES"/>
+                                      <w:storeMappedDataAs w:val="dateTime"/>
+                                      <w:calendar w:val="gregorian"/>
+                                    </w:date>
+                                  </w:sdtPr>
+                                  <w:sdtContent>
+                                    <w:p>
+                                      <w:pPr>
+                                        <w:pStyle w:val="Sinespaciado"/>
+                                        <w:spacing w:line="360" w:lineRule="auto"/>
+                                        <w:rPr>
+                                          <w:color w:val="FFFFFF" w:themeColor="background1"/>
+                                        </w:rPr>
+                                      </w:pPr>
+                                      <w:r>
+                                        <w:rPr>
+                                          <w:color w:val="FFFFFF" w:themeColor="background1"/>
+                                        </w:rPr>
+                                        <w:t>24-9-2026</w:t>
+                                      </w:r>
+                                    </w:p>
+                                  </w:sdtContent>
+                                </w:sdt>
+                              </w:txbxContent>
+                            </wps:txbx>
+                            <wps:bodyPr rot="0" vert="horz" wrap="square" lIns="365760" tIns="182880" rIns="182880" bIns="182880" anchor="b" anchorCtr="0" upright="1">
+                              <a:noAutofit/>
+                            </wps:bodyPr>
+                          </wps:wsp>
+                        </wpg:wgp>
+                      </a:graphicData>
+                    </a:graphic>
+                    <wp14:sizeRelH relativeFrom="page">
+                      <wp14:pctWidth>40000</wp14:pctWidth>
+                    </wp14:sizeRelH>
+                    <wp14:sizeRelV relativeFrom="page">
+                      <wp14:pctHeight>100000</wp14:pctHeight>
+                    </wp14:sizeRelV>
+                  </wp:anchor>
+                </w:drawing>
+              </mc:Choice>
+              <mc:Fallback>
+                <w:pict>
+                  <v:group w14:anchorId="5C0482D1" id="Grupo 252" o:spid="_x0000_s1026" style="position:absolute;margin-left:193.95pt;margin-top:0;width:245.15pt;height:11in;z-index:251659264;mso-width-percent:400;mso-height-percent:1000;mso-position-horizontal:right;mso-position-horizontal-relative:page;mso-position-vertical:top;mso-position-vertical-relative:page;mso-width-percent:400;mso-height-percent:1000" coordsize="31136,100584" o:gfxdata="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">
+                    <v:rect id="Rectángulo 459" o:spid="_x0000_s1027" alt="Light vertical" style="position:absolute;width:1385;height:100584;visibility:visible;mso-wrap-style:square;v-text-anchor:middle" o:gfxdata="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" fillcolor="#8dd873 [1945]" stroked="f" strokecolor="white" strokeweight="1pt">
+                      <v:fill r:id="rId9" o:title="" opacity="52428f" color2="white [3212]" o:opacity2="52428f" type="pattern"/>
+                      <v:shadow color="#d8d8d8" offset="3pt,3pt"/>
+                    </v:rect>
+                    <v:rect id="Rectángulo 460" o:spid="_x0000_s1028" style="position:absolute;left:1246;width:29718;height:100584;visibility:visible;mso-wrap-style:square;v-text-anchor:top" o:gfxdata="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" fillcolor="#95dcf7 [1303]" stroked="f" strokecolor="#d8d8d8"/>
+                    <v:rect id="Rectángulo 461" o:spid="_x0000_s1029" style="position:absolute;left:138;width:30998;height:23774;visibility:visible;mso-wrap-style:square;v-text-anchor:bottom" o:gfxdata="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" filled="f" stroked="f" strokecolor="white" strokeweight="1pt">
+                      <v:fill opacity="52428f"/>
+                      <v:shadow color="#d8d8d8" offset="3pt,3pt"/>
+                      <v:textbox inset="28.8pt,14.4pt,14.4pt,14.4pt">
+                        <w:txbxContent>
+                          <w:sdt>
+                            <w:sdtPr>
+                              <w:rPr>
+                                <w:color w:val="FFFFFF" w:themeColor="background1"/>
+                                <w:sz w:val="96"/>
+                                <w:szCs w:val="96"/>
+                              </w:rPr>
+                              <w:alias w:val="Año"/>
+                              <w:id w:val="1012341074"/>
+                              <w:dataBinding w:prefixMappings="xmlns:ns0='http://schemas.microsoft.com/office/2006/coverPageProps'" w:xpath="/ns0:CoverPageProperties[1]/ns0:PublishDate[1]" w:storeItemID="{55AF091B-3C7A-41E3-B477-F2FDAA23CFDA}"/>
+                              <w:date w:fullDate="2026-09-24T00:00:00Z">
+                                <w:dateFormat w:val="yyyy"/>
+                                <w:lid w:val="es-ES"/>
+                                <w:storeMappedDataAs w:val="dateTime"/>
+                                <w:calendar w:val="gregorian"/>
+                              </w:date>
+                            </w:sdtPr>
+                            <w:sdtContent>
+                              <w:p>
+                                <w:pPr>
+                                  <w:pStyle w:val="Sinespaciado"/>
+                                  <w:rPr>
+                                    <w:color w:val="FFFFFF" w:themeColor="background1"/>
+                                    <w:sz w:val="96"/>
+                                    <w:szCs w:val="96"/>
+                                  </w:rPr>
+                                </w:pPr>
+                                <w:r>
+                                  <w:rPr>
+                                    <w:color w:val="FFFFFF" w:themeColor="background1"/>
+                                    <w:sz w:val="96"/>
+                                    <w:szCs w:val="96"/>
+                                  </w:rPr>
+                                  <w:t>2026</w:t>
+                                </w:r>
+                              </w:p>
+                            </w:sdtContent>
+                          </w:sdt>
+                        </w:txbxContent>
+                      </v:textbox>
+                    </v:rect>
+                    <v:rect id="Rectángulo 9" o:spid="_x0000_s1030" style="position:absolute;top:67610;width:30895;height:28333;visibility:visible;mso-wrap-style:square;v-text-anchor:bottom" o:gfxdata="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" filled="f" stroked="f" strokecolor="white" strokeweight="1pt">
+                      <v:fill opacity="52428f"/>
+                      <v:shadow color="#d8d8d8" offset="3pt,3pt"/>
+                      <v:textbox inset="28.8pt,14.4pt,14.4pt,14.4pt">
+                        <w:txbxContent>
+                          <w:sdt>
+                            <w:sdtPr>
+                              <w:rPr>
+                                <w:color w:val="FFFFFF" w:themeColor="background1"/>
+                              </w:rPr>
+                              <w:alias w:val="Autor"/>
+                              <w:id w:val="1380359617"/>
+                              <w:dataBinding w:prefixMappings="xmlns:ns0='http://schemas.openxmlformats.org/package/2006/metadata/core-properties' xmlns:ns1='http://purl.org/dc/elements/1.1/'" w:xpath="/ns0:coreProperties[1]/ns1:creator[1]" w:storeItemID="{6C3C8BC8-F283-45AE-878A-BAB7291924A1}"/>
+                              <w:text/>
+                            </w:sdtPr>
+                            <w:sdtContent>
+                              <w:p>
+                                <w:pPr>
+                                  <w:pStyle w:val="Sinespaciado"/>
+                                  <w:spacing w:line="360" w:lineRule="auto"/>
+                                  <w:rPr>
+                                    <w:color w:val="FFFFFF" w:themeColor="background1"/>
+                                  </w:rPr>
+                                </w:pPr>
+                                <w:r>
+                                  <w:rPr>
+                                    <w:color w:val="FFFFFF" w:themeColor="background1"/>
+                                  </w:rPr>
+                                  <w:t>Pablo Arias Fernández</w:t>
+                                </w:r>
+                              </w:p>
+                            </w:sdtContent>
+                          </w:sdt>
+                          <w:sdt>
+                            <w:sdtPr>
+                              <w:rPr>
+                                <w:color w:val="FFFFFF" w:themeColor="background1"/>
+                              </w:rPr>
+                              <w:alias w:val="Compañía"/>
+                              <w:id w:val="1760174317"/>
+                              <w:dataBinding w:prefixMappings="xmlns:ns0='http://schemas.openxmlformats.org/officeDocument/2006/extended-properties'" w:xpath="/ns0:Properties[1]/ns0:Company[1]" w:storeItemID="{6668398D-A668-4E3E-A5EB-62B293D839F1}"/>
+                              <w:text/>
+                            </w:sdtPr>
+                            <w:sdtContent>
+                              <w:p>
+                                <w:pPr>
+                                  <w:pStyle w:val="Sinespaciado"/>
+                                  <w:spacing w:line="360" w:lineRule="auto"/>
+                                  <w:rPr>
+                                    <w:color w:val="FFFFFF" w:themeColor="background1"/>
+                                  </w:rPr>
+                                </w:pPr>
+                                <w:r>
+                                  <w:rPr>
+                                    <w:color w:val="FFFFFF" w:themeColor="background1"/>
+                                  </w:rPr>
+                                  <w:t>UO30305@UNIOVI.ES</w:t>
+                                </w:r>
+                              </w:p>
+                            </w:sdtContent>
+                          </w:sdt>
+                          <w:sdt>
+                            <w:sdtPr>
+                              <w:rPr>
+                                <w:color w:val="FFFFFF" w:themeColor="background1"/>
+                              </w:rPr>
+                              <w:alias w:val="Fecha"/>
+                              <w:id w:val="1724480474"/>
+                              <w:dataBinding w:prefixMappings="xmlns:ns0='http://schemas.microsoft.com/office/2006/coverPageProps'" w:xpath="/ns0:CoverPageProperties[1]/ns0:PublishDate[1]" w:storeItemID="{55AF091B-3C7A-41E3-B477-F2FDAA23CFDA}"/>
+                              <w:date w:fullDate="2026-09-24T00:00:00Z">
+                                <w:dateFormat w:val="d-M-yyyy"/>
+                                <w:lid w:val="es-ES"/>
+                                <w:storeMappedDataAs w:val="dateTime"/>
+                                <w:calendar w:val="gregorian"/>
+                              </w:date>
+                            </w:sdtPr>
+                            <w:sdtContent>
+                              <w:p>
+                                <w:pPr>
+                                  <w:pStyle w:val="Sinespaciado"/>
+                                  <w:spacing w:line="360" w:lineRule="auto"/>
+                                  <w:rPr>
+                                    <w:color w:val="FFFFFF" w:themeColor="background1"/>
+                                  </w:rPr>
+                                </w:pPr>
+                                <w:r>
+                                  <w:rPr>
+                                    <w:color w:val="FFFFFF" w:themeColor="background1"/>
+                                  </w:rPr>
+                                  <w:t>24-9-2026</w:t>
+                                </w:r>
+                              </w:p>
+                            </w:sdtContent>
+                          </w:sdt>
+                        </w:txbxContent>
+                      </v:textbox>
+                    </v:rect>
+                    <w10:wrap anchorx="page" anchory="page"/>
+                  </v:group>
+                </w:pict>
+              </mc:Fallback>
+            </mc:AlternateContent>
+          </w:r>
+          <w:r>
+            <w:rPr>
+              <w:noProof/>
+            </w:rPr>
+            <mc:AlternateContent>
+              <mc:Choice Requires="wps">
+                <w:drawing>
+                  <wp:anchor distT="0" distB="0" distL="114300" distR="114300" simplePos="0" relativeHeight="251661312" behindDoc="0" locked="0" layoutInCell="0" allowOverlap="1" wp14:anchorId="1A07C2C8" wp14:editId="36C84288">
+                    <wp:simplePos x="0" y="0"/>
+                    <wp:positionH relativeFrom="page">
+                      <wp:align>left</wp:align>
+                    </wp:positionH>
+                    <mc:AlternateContent>
+                      <mc:Choice Requires="wp14">
+                        <wp:positionV relativeFrom="page">
+                          <wp14:pctPosVOffset>25000</wp14:pctPosVOffset>
+                        </wp:positionV>
+                      </mc:Choice>
+                      <mc:Fallback>
+                        <wp:positionV relativeFrom="page">
+                          <wp:posOffset>2672715</wp:posOffset>
+                        </wp:positionV>
+                      </mc:Fallback>
+                    </mc:AlternateContent>
+                    <wp:extent cx="6970395" cy="640080"/>
+                    <wp:effectExtent l="0" t="0" r="20955" b="20320"/>
+                    <wp:wrapNone/>
+                    <wp:docPr id="463" name="Rectángulo 16"/>
+                    <wp:cNvGraphicFramePr>
+                      <a:graphicFrameLocks xmlns:a="http://schemas.openxmlformats.org/drawingml/2006/main"/>
+                    </wp:cNvGraphicFramePr>
+                    <a:graphic xmlns:a="http://schemas.openxmlformats.org/drawingml/2006/main">
+                      <a:graphicData uri="http://schemas.microsoft.com/office/word/2010/wordprocessingShape">
+                        <wps:wsp>
+                          <wps:cNvSpPr>
+                            <a:spLocks noChangeArrowheads="1"/>
+                          </wps:cNvSpPr>
+                          <wps:spPr bwMode="auto">
+                            <a:xfrm>
+                              <a:off x="0" y="0"/>
+                              <a:ext cx="6970395" cy="640080"/>
+                            </a:xfrm>
+                            <a:prstGeom prst="rect">
+                              <a:avLst/>
+                            </a:prstGeom>
+                            <a:solidFill>
+                              <a:schemeClr val="tx1"/>
+                            </a:solidFill>
+                            <a:ln w="19050">
+                              <a:solidFill>
+                                <a:schemeClr val="tx1"/>
+                              </a:solidFill>
+                              <a:miter lim="800000"/>
+                              <a:headEnd/>
+                              <a:tailEnd/>
+                            </a:ln>
+                          </wps:spPr>
+                          <wps:txbx>
+                            <w:txbxContent>
+                              <w:sdt>
+                                <w:sdtPr>
+                                  <w:rPr>
+                                    <w:color w:val="FFFFFF" w:themeColor="background1"/>
+                                    <w:sz w:val="72"/>
+                                    <w:szCs w:val="72"/>
+                                  </w:rPr>
+                                  <w:alias w:val="Título"/>
+                                  <w:id w:val="-1704864950"/>
+                                  <w:dataBinding w:prefixMappings="xmlns:ns0='http://schemas.openxmlformats.org/package/2006/metadata/core-properties' xmlns:ns1='http://purl.org/dc/elements/1.1/'" w:xpath="/ns0:coreProperties[1]/ns1:title[1]" w:storeItemID="{6C3C8BC8-F283-45AE-878A-BAB7291924A1}"/>
+                                  <w:text/>
+                                </w:sdtPr>
+                                <w:sdtContent>
+                                  <w:p>
+                                    <w:pPr>
+                                      <w:pStyle w:val="Sinespaciado"/>
+                                      <w:jc w:val="right"/>
+                                      <w:rPr>
+                                        <w:color w:val="FFFFFF" w:themeColor="background1"/>
+                                        <w:sz w:val="72"/>
+                                        <w:szCs w:val="72"/>
+                                      </w:rPr>
+                                    </w:pPr>
+                                    <w:r>
+                                      <w:rPr>
+                                        <w:color w:val="FFFFFF" w:themeColor="background1"/>
+                                        <w:sz w:val="72"/>
+                                        <w:szCs w:val="72"/>
+                                      </w:rPr>
+                                      <w:t>Ampliaciones Juego de Naves</w:t>
+                                    </w:r>
+                                  </w:p>
+                                </w:sdtContent>
+                              </w:sdt>
+                            </w:txbxContent>
+                          </wps:txbx>
+                          <wps:bodyPr rot="0" vert="horz" wrap="square" lIns="182880" tIns="45720" rIns="182880" bIns="45720" anchor="ctr" anchorCtr="0" upright="1">
+                            <a:spAutoFit/>
+                          </wps:bodyPr>
+                        </wps:wsp>
+                      </a:graphicData>
+                    </a:graphic>
+                    <wp14:sizeRelH relativeFrom="page">
+                      <wp14:pctWidth>90000</wp14:pctWidth>
+                    </wp14:sizeRelH>
+                    <wp14:sizeRelV relativeFrom="page">
+                      <wp14:pctHeight>7300</wp14:pctHeight>
+                    </wp14:sizeRelV>
+                  </wp:anchor>
+                </w:drawing>
+              </mc:Choice>
+              <mc:Fallback>
+                <w:pict>
+                  <v:rect w14:anchorId="1A07C2C8" id="Rectángulo 16" o:spid="_x0000_s1031" style="position:absolute;margin-left:0;margin-top:0;width:548.85pt;height:50.4pt;z-index:251661312;visibility:visible;mso-wrap-style:square;mso-width-percent:900;mso-height-percent:73;mso-top-percent:250;mso-wrap-distance-left:9pt;mso-wrap-distance-top:0;mso-wrap-distance-right:9pt;mso-wrap-distance-bottom:0;mso-position-horizontal:left;mso-position-horizontal-relative:page;mso-position-vertical-relative:page;mso-width-percent:900;mso-height-percent:73;mso-top-percent:250;mso-width-relative:page;mso-height-relative:page;v-text-anchor:middle" o:gfxdata="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" o:allowincell="f" fillcolor="black [3213]" strokecolor="black [3213]" strokeweight="1.5pt">
+                    <v:textbox style="mso-fit-shape-to-text:t" inset="14.4pt,,14.4pt">
+                      <w:txbxContent>
+                        <w:sdt>
+                          <w:sdtPr>
+                            <w:rPr>
+                              <w:color w:val="FFFFFF" w:themeColor="background1"/>
+                              <w:sz w:val="72"/>
+                              <w:szCs w:val="72"/>
+                            </w:rPr>
+                            <w:alias w:val="Título"/>
+                            <w:id w:val="-1704864950"/>
+                            <w:dataBinding w:prefixMappings="xmlns:ns0='http://schemas.openxmlformats.org/package/2006/metadata/core-properties' xmlns:ns1='http://purl.org/dc/elements/1.1/'" w:xpath="/ns0:coreProperties[1]/ns1:title[1]" w:storeItemID="{6C3C8BC8-F283-45AE-878A-BAB7291924A1}"/>
+                            <w:text/>
+                          </w:sdtPr>
+                          <w:sdtContent>
+                            <w:p>
+                              <w:pPr>
+                                <w:pStyle w:val="Sinespaciado"/>
+                                <w:jc w:val="right"/>
+                                <w:rPr>
+                                  <w:color w:val="FFFFFF" w:themeColor="background1"/>
+                                  <w:sz w:val="72"/>
+                                  <w:szCs w:val="72"/>
+                                </w:rPr>
+                              </w:pPr>
+                              <w:r>
+                                <w:rPr>
+                                  <w:color w:val="FFFFFF" w:themeColor="background1"/>
+                                  <w:sz w:val="72"/>
+                                  <w:szCs w:val="72"/>
+                                </w:rPr>
+                                <w:t>Ampliaciones Juego de Naves</w:t>
+                              </w:r>
+                            </w:p>
+                          </w:sdtContent>
+                        </w:sdt>
+                      </w:txbxContent>
+                    </v:textbox>
+                    <w10:wrap anchorx="page" anchory="page"/>
+                  </v:rect>
+                </w:pict>
+              </mc:Fallback>
+            </mc:AlternateContent>
+          </w:r>
+        </w:p>
+        <w:p>
+          <w:r>
+            <w:rPr>
+              <w:noProof/>
+            </w:rPr>
+            <w:drawing>
+              <wp:anchor distT="0" distB="0" distL="114300" distR="114300" simplePos="0" relativeHeight="251662336" behindDoc="0" locked="0" layoutInCell="1" allowOverlap="1" wp14:anchorId="60DFF071" wp14:editId="79CCE1A8">
+                <wp:simplePos x="0" y="0"/>
+                <wp:positionH relativeFrom="column">
+                  <wp:posOffset>1016635</wp:posOffset>
+                </wp:positionH>
+                <wp:positionV relativeFrom="paragraph">
+                  <wp:posOffset>2898140</wp:posOffset>
+                </wp:positionV>
+                <wp:extent cx="4676775" cy="3419475"/>
+                <wp:effectExtent l="0" t="0" r="9525" b="9525"/>
+                <wp:wrapSquare wrapText="bothSides"/>
+                <wp:docPr id="2030036199" name="Imagen 1"/>
+                <wp:cNvGraphicFramePr>
+                  <a:graphicFrameLocks xmlns:a="http://schemas.openxmlformats.org/drawingml/2006/main" noChangeAspect="1"/>
+                </wp:cNvGraphicFramePr>
+                <a:graphic xmlns:a="http://schemas.openxmlformats.org/drawingml/2006/main">
+                  <a:graphicData uri="http://schemas.openxmlformats.org/drawingml/2006/picture">
+                    <pic:pic xmlns:pic="http://schemas.openxmlformats.org/drawingml/2006/picture">
+                      <pic:nvPicPr>
+                        <pic:cNvPr id="2030036199" name=""/>
+                        <pic:cNvPicPr/>
+                      </pic:nvPicPr>
+                      <pic:blipFill>
+                        <a:blip r:embed="rId10">
+                          <a:extLst>
+                            <a:ext uri="{28A0092B-C50C-407E-A947-70E740481C1C}">
+                              <a14:useLocalDpi xmlns:a14="http://schemas.microsoft.com/office/drawing/2010/main" val="0"/>
+                            </a:ext>
+                          </a:extLst>
+                        </a:blip>
+                        <a:stretch>
+                          <a:fillRect/>
+                        </a:stretch>
+                      </pic:blipFill>
+                      <pic:spPr>
+                        <a:xfrm>
+                          <a:off x="0" y="0"/>
+                          <a:ext cx="4676775" cy="3419475"/>
+                        </a:xfrm>
+                        <a:prstGeom prst="rect">
+                          <a:avLst/>
+                        </a:prstGeom>
+                      </pic:spPr>
+                    </pic:pic>
+                  </a:graphicData>
+                </a:graphic>
+              </wp:anchor>
+            </w:drawing>
+          </w:r>
+          <w:r>
+            <w:br w:type="page"/>
+          </w:r>
+        </w:p>
+      </w:sdtContent>
+    </w:sdt>
+    <w:sdt>
+      <w:sdtPr>
+        <w:rPr>
+          <w:rFonts w:asciiTheme="minorHAnsi" w:eastAsiaTheme="minorHAnsi" w:hAnsiTheme="minorHAnsi" w:cstheme="minorBidi"/>
+          <w:color w:val="auto"/>
+          <w:kern w:val="2"/>
+          <w:sz w:val="24"/>
+          <w:szCs w:val="24"/>
+          <w:lang w:eastAsia="en-US"/>
+          <w14:ligatures w14:val="standardContextual"/>
+        </w:rPr>
+        <w:id w:val="-1015847047"/>
+        <w:docPartObj>
+          <w:docPartGallery w:val="Table of Contents"/>
+          <w:docPartUnique/>
+        </w:docPartObj>
+      </w:sdtPr>
+      <w:sdtEndPr>
+        <w:rPr>
+          <w:b/>
+          <w:bCs/>
+        </w:rPr>
+      </w:sdtEndPr>
+      <w:sdtContent>
+        <w:p>
+          <w:pPr>
+            <w:pStyle w:val="TtuloTDC"/>
+          </w:pPr>
+          <w:r>
+            <w:t>Contenido</w:t>
+          </w:r>
+        </w:p>
+        <w:p>
+          <w:pPr>
+            <w:pStyle w:val="TDC1"/>
+            <w:tabs>
+              <w:tab w:val="left" w:pos="480"/>
+              <w:tab w:val="right" w:leader="dot" w:pos="8494"/>
+            </w:tabs>
+            <w:rPr>
+              <w:rFonts w:eastAsiaTheme="minorEastAsia"/>
+              <w:noProof/>
+              <w:lang w:eastAsia="es-ES"/>
+            </w:rPr>
+          </w:pPr>
+          <w:r>
+            <w:fldChar w:fldCharType="begin"/>
+          </w:r>
+          <w:r>
+            <w:instrText xml:space="preserve"> TOC \o "1-3" \h \z \u </w:instrText>
+          </w:r>
+          <w:r>
+            <w:fldChar w:fldCharType="separate"/>
+          </w:r>
+          <w:hyperlink w:anchor="_Toc241171323" w:history="1">
+            <w:r>
+              <w:rPr>
+                <w:rStyle w:val="Hipervnculo"/>
+                <w:noProof/>
+              </w:rPr>
+              <w:t>1.</w:t>
+            </w:r>
+            <w:r>
+              <w:rPr>
+                <w:rStyle w:val="Hipervnculo"/>
+                <w:noProof/>
+              </w:rPr>
+              <w:t xml:space="preserve"> </w:t>
+            </w:r>
+            <w:r>
+              <w:rPr>
+                <w:rStyle w:val="Hipervnculo"/>
+                <w:noProof/>
+              </w:rPr>
+              <w:t xml:space="preserve">Nuevo </w:t>
+            </w:r>
+            <w:r>
+              <w:rPr>
+                <w:rStyle w:val="Hipervnculo"/>
+                <w:noProof/>
+              </w:rPr>
+              <w:t>t</w:t>
+            </w:r>
+            <w:r>
+              <w:rPr>
+                <w:rStyle w:val="Hipervnculo"/>
+                <w:noProof/>
+              </w:rPr>
+              <w:t>ipo de enemigo</w:t>
+            </w:r>
+            <w:r>
+              <w:rPr>
+                <w:noProof/>
+                <w:webHidden/>
+              </w:rPr>
+              <w:tab/>
+            </w:r>
+            <w:r>
+              <w:rPr>
+                <w:noProof/>
+                <w:webHidden/>
+              </w:rPr>
+              <w:fldChar w:fldCharType="begin"/>
+            </w:r>
+            <w:r>
+              <w:rPr>
+                <w:noProof/>
+                <w:webHidden/>
+              </w:rPr>
+              <w:instrText xml:space="preserve"> PAGEREF _Toc241171323 \h </w:instrText>
+            </w:r>
+            <w:r>
+              <w:rPr>
+                <w:noProof/>
+                <w:webHidden/>
+              </w:rPr>
+            </w:r>
+            <w:r>
+              <w:rPr>
+                <w:noProof/>
+                <w:webHidden/>
+              </w:rPr>
+              <w:fldChar w:fldCharType="separate"/>
+            </w:r>
+            <w:r>
+              <w:rPr>
+                <w:noProof/>
+                <w:webHidden/>
+              </w:rPr>
+              <w:t>1</w:t>
+            </w:r>
+            <w:r>
+              <w:rPr>
+                <w:noProof/>
+                <w:webHidden/>
+              </w:rPr>
+              <w:fldChar w:fldCharType="end"/>
+            </w:r>
+          </w:hyperlink>
+        </w:p>
+        <w:p>
+          <w:pPr>
+            <w:pStyle w:val="TDC1"/>
+            <w:tabs>
+              <w:tab w:val="left" w:pos="480"/>
+              <w:tab w:val="right" w:leader="dot" w:pos="8494"/>
+            </w:tabs>
+            <w:rPr>
+              <w:rFonts w:eastAsiaTheme="minorEastAsia"/>
+              <w:noProof/>
+              <w:lang w:eastAsia="es-ES"/>
+            </w:rPr>
+          </w:pPr>
+          <w:hyperlink w:anchor="_Toc241171324" w:history="1">
+            <w:r>
+              <w:rPr>
+                <w:rStyle w:val="Hipervnculo"/>
+                <w:noProof/>
+              </w:rPr>
+              <w:t>2.</w:t>
+            </w:r>
+            <w:r>
+              <w:rPr>
+                <w:rStyle w:val="Hipervnculo"/>
+                <w:noProof/>
+              </w:rPr>
+              <w:t xml:space="preserve"> </w:t>
+            </w:r>
+            <w:r>
+              <w:rPr>
+                <w:rStyle w:val="Hipervnculo"/>
+                <w:noProof/>
+              </w:rPr>
+              <w:t>Enemigos con capacidad de disparo</w:t>
+            </w:r>
+            <w:r>
+              <w:rPr>
+                <w:noProof/>
+                <w:webHidden/>
+              </w:rPr>
+              <w:tab/>
+            </w:r>
+            <w:r>
+              <w:rPr>
+                <w:noProof/>
+                <w:webHidden/>
+              </w:rPr>
+              <w:fldChar w:fldCharType="begin"/>
+            </w:r>
+            <w:r>
+              <w:rPr>
+                <w:noProof/>
+                <w:webHidden/>
+              </w:rPr>
+              <w:instrText xml:space="preserve"> PAGEREF _Toc241171324 \h </w:instrText>
+            </w:r>
+            <w:r>
+              <w:rPr>
+                <w:noProof/>
+                <w:webHidden/>
+              </w:rPr>
+            </w:r>
+            <w:r>
+              <w:rPr>
+                <w:noProof/>
+                <w:webHidden/>
+              </w:rPr>
+              <w:fldChar w:fldCharType="separate"/>
+            </w:r>
+            <w:r>
+              <w:rPr>
+                <w:noProof/>
+                <w:webHidden/>
+              </w:rPr>
+              <w:t>1</w:t>
+            </w:r>
+            <w:r>
+              <w:rPr>
+                <w:noProof/>
+                <w:webHidden/>
+              </w:rPr>
+              <w:fldChar w:fldCharType="end"/>
+            </w:r>
+          </w:hyperlink>
+        </w:p>
+        <w:p>
+          <w:pPr>
+            <w:pStyle w:val="TDC1"/>
+            <w:tabs>
+              <w:tab w:val="left" w:pos="480"/>
+              <w:tab w:val="right" w:leader="dot" w:pos="8494"/>
+            </w:tabs>
+            <w:rPr>
+              <w:rFonts w:eastAsiaTheme="minorEastAsia"/>
+              <w:noProof/>
+              <w:lang w:eastAsia="es-ES"/>
+            </w:rPr>
+          </w:pPr>
+          <w:hyperlink w:anchor="_Toc241171325" w:history="1">
+            <w:r>
+              <w:rPr>
+                <w:rStyle w:val="Hipervnculo"/>
+                <w:noProof/>
+              </w:rPr>
+              <w:t>3.</w:t>
+            </w:r>
+            <w:r>
+              <w:rPr>
+                <w:rStyle w:val="Hipervnculo"/>
+                <w:noProof/>
+              </w:rPr>
+              <w:t xml:space="preserve"> </w:t>
+            </w:r>
+            <w:r>
+              <w:rPr>
+                <w:rStyle w:val="Hipervnculo"/>
+                <w:noProof/>
+              </w:rPr>
+              <w:t>Jugador con Vida</w:t>
+            </w:r>
+            <w:r>
+              <w:rPr>
+                <w:noProof/>
+                <w:webHidden/>
+              </w:rPr>
+              <w:tab/>
+            </w:r>
+            <w:r>
+              <w:rPr>
+                <w:noProof/>
+                <w:webHidden/>
+              </w:rPr>
+              <w:fldChar w:fldCharType="begin"/>
+            </w:r>
+            <w:r>
+              <w:rPr>
+                <w:noProof/>
+                <w:webHidden/>
+              </w:rPr>
+              <w:instrText xml:space="preserve"> PAGEREF _Toc241171325 \h </w:instrText>
+            </w:r>
+            <w:r>
+              <w:rPr>
+                <w:noProof/>
+                <w:webHidden/>
+              </w:rPr>
+            </w:r>
+            <w:r>
+              <w:rPr>
+                <w:noProof/>
+                <w:webHidden/>
+              </w:rPr>
+              <w:fldChar w:fldCharType="separate"/>
+            </w:r>
+            <w:r>
+              <w:rPr>
+                <w:noProof/>
+                <w:webHidden/>
+              </w:rPr>
+              <w:t>1</w:t>
+            </w:r>
+            <w:r>
+              <w:rPr>
+                <w:noProof/>
+                <w:webHidden/>
+              </w:rPr>
+              <w:fldChar w:fldCharType="end"/>
+            </w:r>
+          </w:hyperlink>
+        </w:p>
+        <w:p>
+          <w:pPr>
+            <w:pStyle w:val="TDC1"/>
+            <w:tabs>
+              <w:tab w:val="right" w:leader="dot" w:pos="8494"/>
+            </w:tabs>
+            <w:rPr>
+              <w:rFonts w:eastAsiaTheme="minorEastAsia"/>
+              <w:noProof/>
+              <w:lang w:eastAsia="es-ES"/>
+            </w:rPr>
+          </w:pPr>
+          <w:hyperlink w:anchor="_Toc241171326" w:history="1">
+            <w:r>
+              <w:rPr>
+                <w:rStyle w:val="Hipervnculo"/>
+                <w:noProof/>
+              </w:rPr>
+              <w:t>5. Cambio de Nave</w:t>
+            </w:r>
+            <w:r>
+              <w:rPr>
+                <w:noProof/>
+                <w:webHidden/>
+              </w:rPr>
+              <w:tab/>
+            </w:r>
+            <w:r>
+              <w:rPr>
+                <w:noProof/>
+                <w:webHidden/>
+              </w:rPr>
+              <w:fldChar w:fldCharType="begin"/>
+            </w:r>
+            <w:r>
+              <w:rPr>
+                <w:noProof/>
+                <w:webHidden/>
+              </w:rPr>
+              <w:instrText xml:space="preserve"> PAGEREF _Toc241171326 \h </w:instrText>
+            </w:r>
+            <w:r>
+              <w:rPr>
+                <w:noProof/>
+                <w:webHidden/>
+              </w:rPr>
+            </w:r>
+            <w:r>
+              <w:rPr>
+                <w:noProof/>
+                <w:webHidden/>
+              </w:rPr>
+              <w:fldChar w:fldCharType="separate"/>
+            </w:r>
+            <w:r>
+              <w:rPr>
+                <w:noProof/>
+                <w:webHidden/>
+              </w:rPr>
+              <w:t>1</w:t>
+            </w:r>
+            <w:r>
+              <w:rPr>
+                <w:noProof/>
+                <w:webHidden/>
+              </w:rPr>
+              <w:fldChar w:fldCharType="end"/>
+            </w:r>
+          </w:hyperlink>
+        </w:p>
+        <w:p>
+          <w:pPr>
+            <w:pStyle w:val="TDC1"/>
+            <w:tabs>
+              <w:tab w:val="right" w:leader="dot" w:pos="8494"/>
+            </w:tabs>
+            <w:rPr>
+              <w:rFonts w:eastAsiaTheme="minorEastAsia"/>
+              <w:noProof/>
+              <w:lang w:eastAsia="es-ES"/>
+            </w:rPr>
+          </w:pPr>
+          <w:hyperlink w:anchor="_Toc241171327" w:history="1">
+            <w:r>
+              <w:rPr>
+                <w:rStyle w:val="Hipervnculo"/>
+                <w:noProof/>
+              </w:rPr>
+              <w:t>9. Disparo especial</w:t>
+            </w:r>
+            <w:r>
+              <w:rPr>
+                <w:noProof/>
+                <w:webHidden/>
+              </w:rPr>
+              <w:tab/>
+            </w:r>
+            <w:r>
+              <w:rPr>
+                <w:noProof/>
+                <w:webHidden/>
+              </w:rPr>
+              <w:fldChar w:fldCharType="begin"/>
+            </w:r>
+            <w:r>
+              <w:rPr>
+                <w:noProof/>
+                <w:webHidden/>
+              </w:rPr>
+              <w:instrText xml:space="preserve"> PAGEREF _Toc241171327 \h </w:instrText>
+            </w:r>
+            <w:r>
+              <w:rPr>
+                <w:noProof/>
+                <w:webHidden/>
+              </w:rPr>
+            </w:r>
+            <w:r>
+              <w:rPr>
+                <w:noProof/>
+                <w:webHidden/>
+              </w:rPr>
+              <w:fldChar w:fldCharType="separate"/>
+            </w:r>
+            <w:r>
+              <w:rPr>
+                <w:noProof/>
+                <w:webHidden/>
+              </w:rPr>
+              <w:t>1</w:t>
+            </w:r>
+            <w:r>
+              <w:rPr>
+                <w:noProof/>
+                <w:webHidden/>
+              </w:rPr>
+              <w:fldChar w:fldCharType="end"/>
+            </w:r>
+          </w:hyperlink>
+        </w:p>
+        <w:p>
+          <w:r>
+            <w:rPr>
+              <w:b/>
+              <w:bCs/>
+            </w:rPr>
+            <w:fldChar w:fldCharType="end"/>
+          </w:r>
+        </w:p>
+      </w:sdtContent>
+    </w:sdt>
     <w:p>
-      <w:r>
-        <w:t>Ampliaciones realizadas:</w:t>
+      <w:pPr>
+        <w:rPr>
+          <w:rFonts w:asciiTheme="majorHAnsi" w:eastAsiaTheme="majorEastAsia" w:hAnsiTheme="majorHAnsi" w:cstheme="majorBidi"/>
+          <w:color w:val="0F4761" w:themeColor="accent1" w:themeShade="BF"/>
+          <w:sz w:val="40"/>
+          <w:szCs w:val="40"/>
+        </w:rPr>
+      </w:pPr>
+      <w:r>
+        <w:br w:type="page"/>
       </w:r>
     </w:p>
     <w:p>
       <w:pPr>
-        <w:rPr>
-          <w:rFonts w:ascii="Calibri" w:hAnsi="Calibri" w:cs="Calibri"/>
-          <w:color w:val="000000"/>
-        </w:rPr>
-      </w:pPr>
-      <w:r>
-        <w:rPr>
-          <w:rFonts w:ascii="Calibri" w:hAnsi="Calibri" w:cs="Calibri"/>
-          <w:color w:val="000000"/>
-        </w:rPr>
-        <w:t xml:space="preserve">1 </w:t>
-      </w:r>
-      <w:proofErr w:type="gramStart"/>
-      <w:r>
-        <w:rPr>
-          <w:rFonts w:ascii="Calibri" w:hAnsi="Calibri" w:cs="Calibri"/>
-          <w:color w:val="000000"/>
-        </w:rPr>
-        <w:t>Nuevo</w:t>
-      </w:r>
-      <w:proofErr w:type="gramEnd"/>
-      <w:r>
-        <w:rPr>
-          <w:rFonts w:ascii="Calibri" w:hAnsi="Calibri" w:cs="Calibri"/>
-          <w:color w:val="000000"/>
-        </w:rPr>
-        <w:t xml:space="preserve"> tipo de enemigo</w:t>
-      </w:r>
+        <w:pStyle w:val="Ttulo1"/>
+        <w:numPr>
+          <w:ilvl w:val="0"/>
+          <w:numId w:val="6"/>
+        </w:numPr>
+      </w:pPr>
+      <w:bookmarkStart w:id="0" w:name="_Toc241171323"/>
+      <w:r>
+        <w:lastRenderedPageBreak/>
+        <w:t>Nuevo tipo de enemigo</w:t>
+      </w:r>
+      <w:bookmarkEnd w:id="0"/>
     </w:p>
     <w:p>
       <w:pPr>
-        <w:rPr>
-          <w:rFonts w:ascii="Calibri" w:hAnsi="Calibri" w:cs="Calibri"/>
-          <w:color w:val="000000"/>
-        </w:rPr>
-      </w:pPr>
-      <w:r>
-        <w:rPr>
-          <w:rFonts w:ascii="Calibri" w:hAnsi="Calibri" w:cs="Calibri"/>
-          <w:color w:val="000000"/>
-        </w:rPr>
-        <w:t xml:space="preserve">2 </w:t>
-      </w:r>
-      <w:proofErr w:type="gramStart"/>
-      <w:r>
-        <w:rPr>
-          <w:rFonts w:ascii="Calibri" w:hAnsi="Calibri" w:cs="Calibri"/>
-          <w:color w:val="000000"/>
-        </w:rPr>
-        <w:t>Enemigos</w:t>
-      </w:r>
-      <w:proofErr w:type="gramEnd"/>
-      <w:r>
-        <w:rPr>
-          <w:rFonts w:ascii="Calibri" w:hAnsi="Calibri" w:cs="Calibri"/>
-          <w:color w:val="000000"/>
-        </w:rPr>
-        <w:t xml:space="preserve"> con capacidad de disparo</w:t>
+        <w:pStyle w:val="Prrafodelista"/>
+      </w:pPr>
+      <w:r>
+        <w:t xml:space="preserve">Para realizar este ejercicio creé una clase base Enemy, que tiene los comportamientos comunes de los enemigos, y después la extendí para crear dos enemigos diferentes: </w:t>
+      </w:r>
+      <w:proofErr w:type="spellStart"/>
+      <w:r>
+        <w:t>CommonEnemy</w:t>
+      </w:r>
+      <w:proofErr w:type="spellEnd"/>
+      <w:r>
+        <w:t xml:space="preserve"> (el creado en clase), y </w:t>
+      </w:r>
+      <w:proofErr w:type="spellStart"/>
+      <w:r>
+        <w:t>SpecialEnemy</w:t>
+      </w:r>
+      <w:proofErr w:type="spellEnd"/>
+      <w:r>
+        <w:t>.</w:t>
       </w:r>
     </w:p>
     <w:p>
       <w:pPr>
-        <w:rPr>
-          <w:rFonts w:ascii="Calibri" w:hAnsi="Calibri" w:cs="Calibri"/>
-          <w:color w:val="000000"/>
-        </w:rPr>
-      </w:pPr>
-      <w:r>
-        <w:rPr>
-          <w:rFonts w:ascii="Calibri" w:hAnsi="Calibri" w:cs="Calibri"/>
-          <w:color w:val="000000"/>
-        </w:rPr>
-        <w:t xml:space="preserve">3 </w:t>
-      </w:r>
-      <w:proofErr w:type="gramStart"/>
-      <w:r>
-        <w:rPr>
-          <w:rFonts w:ascii="Calibri" w:hAnsi="Calibri" w:cs="Calibri"/>
-          <w:color w:val="000000"/>
-        </w:rPr>
-        <w:t>Jugador</w:t>
-      </w:r>
-      <w:proofErr w:type="gramEnd"/>
-      <w:r>
-        <w:rPr>
-          <w:rFonts w:ascii="Calibri" w:hAnsi="Calibri" w:cs="Calibri"/>
-          <w:color w:val="000000"/>
-        </w:rPr>
-        <w:t xml:space="preserve"> con Vid</w:t>
-      </w:r>
-      <w:r>
-        <w:rPr>
-          <w:rFonts w:ascii="Calibri" w:hAnsi="Calibri" w:cs="Calibri"/>
-          <w:color w:val="000000"/>
-        </w:rPr>
-        <w:t>a</w:t>
-      </w:r>
+        <w:pStyle w:val="Prrafodelista"/>
+      </w:pPr>
     </w:p>
     <w:p>
       <w:pPr>
-        <w:rPr>
-          <w:rFonts w:ascii="Calibri" w:hAnsi="Calibri" w:cs="Calibri"/>
-          <w:color w:val="000000"/>
-        </w:rPr>
-      </w:pPr>
-      <w:r>
-        <w:rPr>
-          <w:rFonts w:ascii="Calibri" w:hAnsi="Calibri" w:cs="Calibri"/>
-          <w:color w:val="000000"/>
-        </w:rPr>
-        <w:t xml:space="preserve">5 </w:t>
-      </w:r>
-      <w:proofErr w:type="gramStart"/>
-      <w:r>
-        <w:rPr>
-          <w:rFonts w:ascii="Calibri" w:hAnsi="Calibri" w:cs="Calibri"/>
-          <w:color w:val="000000"/>
-        </w:rPr>
-        <w:t>Cambio</w:t>
-      </w:r>
-      <w:proofErr w:type="gramEnd"/>
-      <w:r>
-        <w:rPr>
-          <w:rFonts w:ascii="Calibri" w:hAnsi="Calibri" w:cs="Calibri"/>
-          <w:color w:val="000000"/>
-        </w:rPr>
-        <w:t xml:space="preserve"> de Nave</w:t>
+        <w:pStyle w:val="Prrafodelista"/>
+      </w:pPr>
+      <w:r>
+        <w:t>En esta primera imagen vemos</w:t>
+      </w:r>
+      <w:r>
+        <w:t xml:space="preserve"> </w:t>
+      </w:r>
+      <w:r>
+        <w:t xml:space="preserve">que se ha añadido </w:t>
+      </w:r>
+      <w:r>
+        <w:t xml:space="preserve">el método </w:t>
+      </w:r>
+      <w:proofErr w:type="spellStart"/>
+      <w:r>
+        <w:t>setAnimation</w:t>
+      </w:r>
+      <w:proofErr w:type="spellEnd"/>
+      <w:r>
+        <w:t xml:space="preserve"> para reducir la cantidad de parámetros a introducir en Enemy.</w:t>
+      </w:r>
+      <w:r>
+        <w:t xml:space="preserve"> Haciendo que no sea obligatorio meter animación a un Actor de no quererse.</w:t>
       </w:r>
     </w:p>
     <w:p>
       <w:pPr>
+        <w:pStyle w:val="Prrafodelista"/>
+      </w:pPr>
+      <w:r>
         <w:rPr>
-          <w:rFonts w:ascii="Calibri" w:hAnsi="Calibri" w:cs="Calibri"/>
-          <w:color w:val="000000"/>
+          <w:noProof/>
         </w:rPr>
-      </w:pPr>
+        <w:drawing>
+          <wp:inline distT="0" distB="0" distL="0" distR="0" wp14:anchorId="3B92CDB4" wp14:editId="45259D4C">
+            <wp:extent cx="5400040" cy="2346960"/>
+            <wp:effectExtent l="0" t="0" r="0" b="0"/>
+            <wp:docPr id="1121554429" name="Imagen 1"/>
+            <wp:cNvGraphicFramePr>
+              <a:graphicFrameLocks xmlns:a="http://schemas.openxmlformats.org/drawingml/2006/main" noChangeAspect="1"/>
+            </wp:cNvGraphicFramePr>
+            <a:graphic xmlns:a="http://schemas.openxmlformats.org/drawingml/2006/main">
+              <a:graphicData uri="http://schemas.openxmlformats.org/drawingml/2006/picture">
+                <pic:pic xmlns:pic="http://schemas.openxmlformats.org/drawingml/2006/picture">
+                  <pic:nvPicPr>
+                    <pic:cNvPr id="1121554429" name=""/>
+                    <pic:cNvPicPr/>
+                  </pic:nvPicPr>
+                  <pic:blipFill>
+                    <a:blip r:embed="rId11"/>
+                    <a:stretch>
+                      <a:fillRect/>
+                    </a:stretch>
+                  </pic:blipFill>
+                  <pic:spPr>
+                    <a:xfrm>
+                      <a:off x="0" y="0"/>
+                      <a:ext cx="5400040" cy="2346960"/>
+                    </a:xfrm>
+                    <a:prstGeom prst="rect">
+                      <a:avLst/>
+                    </a:prstGeom>
+                  </pic:spPr>
+                </pic:pic>
+              </a:graphicData>
+            </a:graphic>
+          </wp:inline>
+        </w:drawing>
+      </w:r>
+      <w:r>
+        <w:br/>
+      </w:r>
+    </w:p>
+    <w:p>
+      <w:pPr>
+        <w:pStyle w:val="Prrafodelista"/>
+      </w:pPr>
+      <w:r>
+        <w:t>Esta es la implementación del enemigo especial, cuyo patrón de movimiento consiste en una especie de zigzag:</w:t>
+      </w:r>
       <w:r>
         <w:rPr>
-          <w:rFonts w:ascii="Calibri" w:hAnsi="Calibri" w:cs="Calibri"/>
-          <w:color w:val="000000"/>
+          <w:noProof/>
         </w:rPr>
-        <w:t xml:space="preserve">9 </w:t>
+        <w:drawing>
+          <wp:inline distT="0" distB="0" distL="0" distR="0" wp14:anchorId="39529B58" wp14:editId="3B0826AC">
+            <wp:extent cx="4781550" cy="3671628"/>
+            <wp:effectExtent l="0" t="0" r="0" b="5080"/>
+            <wp:docPr id="1861563501" name="Imagen 1"/>
+            <wp:cNvGraphicFramePr>
+              <a:graphicFrameLocks xmlns:a="http://schemas.openxmlformats.org/drawingml/2006/main" noChangeAspect="1"/>
+            </wp:cNvGraphicFramePr>
+            <a:graphic xmlns:a="http://schemas.openxmlformats.org/drawingml/2006/main">
+              <a:graphicData uri="http://schemas.openxmlformats.org/drawingml/2006/picture">
+                <pic:pic xmlns:pic="http://schemas.openxmlformats.org/drawingml/2006/picture">
+                  <pic:nvPicPr>
+                    <pic:cNvPr id="1861563501" name=""/>
+                    <pic:cNvPicPr/>
+                  </pic:nvPicPr>
+                  <pic:blipFill>
+                    <a:blip r:embed="rId12"/>
+                    <a:stretch>
+                      <a:fillRect/>
+                    </a:stretch>
+                  </pic:blipFill>
+                  <pic:spPr>
+                    <a:xfrm>
+                      <a:off x="0" y="0"/>
+                      <a:ext cx="4786425" cy="3675371"/>
+                    </a:xfrm>
+                    <a:prstGeom prst="rect">
+                      <a:avLst/>
+                    </a:prstGeom>
+                  </pic:spPr>
+                </pic:pic>
+              </a:graphicData>
+            </a:graphic>
+          </wp:inline>
+        </w:drawing>
+      </w:r>
+    </w:p>
+    <w:p>
+      <w:pPr>
+        <w:pStyle w:val="Prrafodelista"/>
+      </w:pPr>
+      <w:r>
+        <w:lastRenderedPageBreak/>
+        <w:t>P</w:t>
+      </w:r>
+      <w:r>
+        <w:t xml:space="preserve">or </w:t>
       </w:r>
       <w:proofErr w:type="gramStart"/>
       <w:r>
+        <w:t>último</w:t>
+      </w:r>
+      <w:proofErr w:type="gramEnd"/>
+      <w:r>
+        <w:t xml:space="preserve"> muestro</w:t>
+      </w:r>
+      <w:r>
+        <w:t xml:space="preserve"> la modificación </w:t>
+      </w:r>
+      <w:r>
+        <w:t xml:space="preserve">hecha sobre </w:t>
+      </w:r>
+      <w:r>
+        <w:t>el generador de enemigos, que por aportar algo de aleatoriedad hace que uno de cada tres enemigos que salgan sean de tipo especial:</w:t>
+      </w:r>
+      <w:r>
+        <w:br/>
+      </w:r>
+      <w:r>
         <w:rPr>
-          <w:rFonts w:ascii="Calibri" w:hAnsi="Calibri" w:cs="Calibri"/>
-          <w:color w:val="000000"/>
+          <w:noProof/>
         </w:rPr>
-        <w:t>Disparo</w:t>
+        <w:drawing>
+          <wp:inline distT="0" distB="0" distL="0" distR="0" wp14:anchorId="3256AC42" wp14:editId="57EE80FF">
+            <wp:extent cx="5400040" cy="2487930"/>
+            <wp:effectExtent l="0" t="0" r="0" b="7620"/>
+            <wp:docPr id="1757743709" name="Imagen 1"/>
+            <wp:cNvGraphicFramePr>
+              <a:graphicFrameLocks xmlns:a="http://schemas.openxmlformats.org/drawingml/2006/main" noChangeAspect="1"/>
+            </wp:cNvGraphicFramePr>
+            <a:graphic xmlns:a="http://schemas.openxmlformats.org/drawingml/2006/main">
+              <a:graphicData uri="http://schemas.openxmlformats.org/drawingml/2006/picture">
+                <pic:pic xmlns:pic="http://schemas.openxmlformats.org/drawingml/2006/picture">
+                  <pic:nvPicPr>
+                    <pic:cNvPr id="1757743709" name=""/>
+                    <pic:cNvPicPr/>
+                  </pic:nvPicPr>
+                  <pic:blipFill>
+                    <a:blip r:embed="rId13"/>
+                    <a:stretch>
+                      <a:fillRect/>
+                    </a:stretch>
+                  </pic:blipFill>
+                  <pic:spPr>
+                    <a:xfrm>
+                      <a:off x="0" y="0"/>
+                      <a:ext cx="5400040" cy="2487930"/>
+                    </a:xfrm>
+                    <a:prstGeom prst="rect">
+                      <a:avLst/>
+                    </a:prstGeom>
+                  </pic:spPr>
+                </pic:pic>
+              </a:graphicData>
+            </a:graphic>
+          </wp:inline>
+        </w:drawing>
+      </w:r>
+      <w:r>
+        <w:br/>
+      </w:r>
+    </w:p>
+    <w:p>
+      <w:r>
+        <w:br w:type="page"/>
+      </w:r>
+    </w:p>
+    <w:p>
+      <w:pPr>
+        <w:pStyle w:val="Ttulo1"/>
+        <w:numPr>
+          <w:ilvl w:val="0"/>
+          <w:numId w:val="6"/>
+        </w:numPr>
+      </w:pPr>
+      <w:bookmarkStart w:id="1" w:name="_Toc241171324"/>
+      <w:r>
+        <w:lastRenderedPageBreak/>
+        <w:t>Enemigos con capacidad de disparo</w:t>
+      </w:r>
+      <w:bookmarkEnd w:id="1"/>
+    </w:p>
+    <w:p>
+      <w:pPr>
+        <w:ind w:left="708"/>
+      </w:pPr>
+      <w:bookmarkStart w:id="2" w:name="_Toc241171325"/>
+      <w:r>
+        <w:t xml:space="preserve">Para realizar este ejercicio creí conveniente reutilizar la clase </w:t>
+      </w:r>
+      <w:proofErr w:type="spellStart"/>
+      <w:r>
+        <w:t>Projectile</w:t>
+      </w:r>
+      <w:proofErr w:type="spellEnd"/>
+      <w:r>
+        <w:t xml:space="preserve"> creada en clase, ya que</w:t>
+      </w:r>
+      <w:r>
+        <w:t xml:space="preserve"> independientemente de quien </w:t>
+      </w:r>
+      <w:r>
+        <w:t xml:space="preserve">lo </w:t>
+      </w:r>
+      <w:proofErr w:type="gramStart"/>
+      <w:r>
+        <w:t>dispare</w:t>
       </w:r>
       <w:proofErr w:type="gramEnd"/>
       <w:r>
+        <w:t xml:space="preserve"> un proyectil es un proyectil.</w:t>
+      </w:r>
+    </w:p>
+    <w:p>
+      <w:pPr>
+        <w:ind w:left="708"/>
+      </w:pPr>
+      <w:r>
+        <w:t xml:space="preserve">Para ello utilicé una variable </w:t>
+      </w:r>
+      <w:proofErr w:type="spellStart"/>
+      <w:r>
+        <w:t>owner</w:t>
+      </w:r>
+      <w:proofErr w:type="spellEnd"/>
+      <w:r>
+        <w:t xml:space="preserve"> </w:t>
+      </w:r>
+      <w:r>
+        <w:t>que nos dice quién</w:t>
+      </w:r>
+      <w:r>
+        <w:t xml:space="preserve"> es el dueño del proyectil</w:t>
+      </w:r>
+      <w:r>
+        <w:t>, además de</w:t>
+      </w:r>
+      <w:r>
+        <w:t xml:space="preserve"> permi</w:t>
+      </w:r>
+      <w:r>
+        <w:t>tir</w:t>
+      </w:r>
+      <w:r>
+        <w:t xml:space="preserve"> pasarle la </w:t>
+      </w:r>
+      <w:r>
+        <w:t>velocidad</w:t>
+      </w:r>
+      <w:r>
+        <w:t xml:space="preserve"> del disparo</w:t>
+      </w:r>
+      <w:r>
+        <w:t xml:space="preserve"> para gestionar su sentido</w:t>
+      </w:r>
+      <w:r>
+        <w:t>:</w:t>
+      </w:r>
+      <w:r>
+        <w:br/>
+      </w:r>
+      <w:r>
         <w:rPr>
-          <w:rFonts w:ascii="Calibri" w:hAnsi="Calibri" w:cs="Calibri"/>
-          <w:color w:val="000000"/>
+          <w:noProof/>
         </w:rPr>
-        <w:t xml:space="preserve"> especial</w:t>
+        <w:drawing>
+          <wp:inline distT="0" distB="0" distL="0" distR="0" wp14:anchorId="79F2FA38" wp14:editId="6FE20854">
+            <wp:extent cx="5400040" cy="1898650"/>
+            <wp:effectExtent l="0" t="0" r="0" b="6350"/>
+            <wp:docPr id="796443971" name="Imagen 1"/>
+            <wp:cNvGraphicFramePr>
+              <a:graphicFrameLocks xmlns:a="http://schemas.openxmlformats.org/drawingml/2006/main" noChangeAspect="1"/>
+            </wp:cNvGraphicFramePr>
+            <a:graphic xmlns:a="http://schemas.openxmlformats.org/drawingml/2006/main">
+              <a:graphicData uri="http://schemas.openxmlformats.org/drawingml/2006/picture">
+                <pic:pic xmlns:pic="http://schemas.openxmlformats.org/drawingml/2006/picture">
+                  <pic:nvPicPr>
+                    <pic:cNvPr id="796443971" name=""/>
+                    <pic:cNvPicPr/>
+                  </pic:nvPicPr>
+                  <pic:blipFill>
+                    <a:blip r:embed="rId14"/>
+                    <a:stretch>
+                      <a:fillRect/>
+                    </a:stretch>
+                  </pic:blipFill>
+                  <pic:spPr>
+                    <a:xfrm>
+                      <a:off x="0" y="0"/>
+                      <a:ext cx="5400040" cy="1898650"/>
+                    </a:xfrm>
+                    <a:prstGeom prst="rect">
+                      <a:avLst/>
+                    </a:prstGeom>
+                  </pic:spPr>
+                </pic:pic>
+              </a:graphicData>
+            </a:graphic>
+          </wp:inline>
+        </w:drawing>
+      </w:r>
+    </w:p>
+    <w:p>
+      <w:pPr>
+        <w:ind w:left="708"/>
+      </w:pPr>
+      <w:r>
+        <w:t xml:space="preserve">Después creé un método </w:t>
+      </w:r>
+      <w:proofErr w:type="spellStart"/>
+      <w:r>
+        <w:t>shoot</w:t>
+      </w:r>
+      <w:proofErr w:type="spellEnd"/>
+      <w:r>
+        <w:t xml:space="preserve"> en la clase genérica Enemy para que cualquier enemigo que se cree pueda tener acceso a esta función. </w:t>
+      </w:r>
+      <w:r>
+        <w:br/>
+      </w:r>
+      <w:r>
+        <w:rPr>
+          <w:noProof/>
+        </w:rPr>
+        <w:drawing>
+          <wp:inline distT="0" distB="0" distL="0" distR="0" wp14:anchorId="373E7A95" wp14:editId="5147FE89">
+            <wp:extent cx="5400040" cy="2376170"/>
+            <wp:effectExtent l="0" t="0" r="0" b="5080"/>
+            <wp:docPr id="1641140992" name="Imagen 1"/>
+            <wp:cNvGraphicFramePr>
+              <a:graphicFrameLocks xmlns:a="http://schemas.openxmlformats.org/drawingml/2006/main" noChangeAspect="1"/>
+            </wp:cNvGraphicFramePr>
+            <a:graphic xmlns:a="http://schemas.openxmlformats.org/drawingml/2006/main">
+              <a:graphicData uri="http://schemas.openxmlformats.org/drawingml/2006/picture">
+                <pic:pic xmlns:pic="http://schemas.openxmlformats.org/drawingml/2006/picture">
+                  <pic:nvPicPr>
+                    <pic:cNvPr id="1641140992" name=""/>
+                    <pic:cNvPicPr/>
+                  </pic:nvPicPr>
+                  <pic:blipFill>
+                    <a:blip r:embed="rId15"/>
+                    <a:stretch>
+                      <a:fillRect/>
+                    </a:stretch>
+                  </pic:blipFill>
+                  <pic:spPr>
+                    <a:xfrm>
+                      <a:off x="0" y="0"/>
+                      <a:ext cx="5400040" cy="2376170"/>
+                    </a:xfrm>
+                    <a:prstGeom prst="rect">
+                      <a:avLst/>
+                    </a:prstGeom>
+                  </pic:spPr>
+                </pic:pic>
+              </a:graphicData>
+            </a:graphic>
+          </wp:inline>
+        </w:drawing>
+      </w:r>
+    </w:p>
+    <w:p>
+      <w:pPr>
+        <w:pStyle w:val="Prrafodelista"/>
+      </w:pPr>
+      <w:r>
+        <w:t xml:space="preserve">A su vez en este fragmento de código vemos el método </w:t>
+      </w:r>
+      <w:proofErr w:type="spellStart"/>
+      <w:r>
+        <w:t>changeTexture</w:t>
+      </w:r>
+      <w:proofErr w:type="spellEnd"/>
+      <w:r>
+        <w:t>, el cual vive</w:t>
+      </w:r>
+      <w:r>
+        <w:t xml:space="preserve"> en Actor </w:t>
+      </w:r>
+      <w:r>
+        <w:t xml:space="preserve">y </w:t>
+      </w:r>
+      <w:r>
+        <w:t xml:space="preserve">facilita </w:t>
+      </w:r>
+      <w:r>
+        <w:t>la operación de cambiar la textura</w:t>
+      </w:r>
+      <w:r>
+        <w:t>:</w:t>
+      </w:r>
+      <w:r>
+        <w:br/>
+      </w:r>
+      <w:r>
+        <w:rPr>
+          <w:noProof/>
+        </w:rPr>
+        <w:drawing>
+          <wp:inline distT="0" distB="0" distL="0" distR="0" wp14:anchorId="31087191" wp14:editId="2BF9A6B0">
+            <wp:extent cx="5400040" cy="1214120"/>
+            <wp:effectExtent l="0" t="0" r="0" b="5080"/>
+            <wp:docPr id="712342086" name="Imagen 1"/>
+            <wp:cNvGraphicFramePr>
+              <a:graphicFrameLocks xmlns:a="http://schemas.openxmlformats.org/drawingml/2006/main" noChangeAspect="1"/>
+            </wp:cNvGraphicFramePr>
+            <a:graphic xmlns:a="http://schemas.openxmlformats.org/drawingml/2006/main">
+              <a:graphicData uri="http://schemas.openxmlformats.org/drawingml/2006/picture">
+                <pic:pic xmlns:pic="http://schemas.openxmlformats.org/drawingml/2006/picture">
+                  <pic:nvPicPr>
+                    <pic:cNvPr id="712342086" name=""/>
+                    <pic:cNvPicPr/>
+                  </pic:nvPicPr>
+                  <pic:blipFill>
+                    <a:blip r:embed="rId16"/>
+                    <a:stretch>
+                      <a:fillRect/>
+                    </a:stretch>
+                  </pic:blipFill>
+                  <pic:spPr>
+                    <a:xfrm>
+                      <a:off x="0" y="0"/>
+                      <a:ext cx="5400040" cy="1214120"/>
+                    </a:xfrm>
+                    <a:prstGeom prst="rect">
+                      <a:avLst/>
+                    </a:prstGeom>
+                  </pic:spPr>
+                </pic:pic>
+              </a:graphicData>
+            </a:graphic>
+          </wp:inline>
+        </w:drawing>
+      </w:r>
+    </w:p>
+    <w:p>
+      <w:pPr>
+        <w:ind w:left="708"/>
+      </w:pPr>
+    </w:p>
+    <w:p>
+      <w:pPr>
+        <w:ind w:left="708"/>
+      </w:pPr>
+      <w:r>
+        <w:lastRenderedPageBreak/>
+        <w:t xml:space="preserve">Cabe destacar que </w:t>
+      </w:r>
+      <w:r>
+        <w:t xml:space="preserve">el querer reutilizar la clase </w:t>
+      </w:r>
+      <w:proofErr w:type="spellStart"/>
+      <w:r>
+        <w:t>Projectile</w:t>
+      </w:r>
+      <w:proofErr w:type="spellEnd"/>
+      <w:r>
+        <w:t xml:space="preserve"> me hizo tener que cambiar el </w:t>
+      </w:r>
+      <w:proofErr w:type="spellStart"/>
+      <w:r>
+        <w:t>update</w:t>
+      </w:r>
+      <w:proofErr w:type="spellEnd"/>
+      <w:r>
+        <w:t xml:space="preserve"> de Enemy para </w:t>
+      </w:r>
+      <w:r>
+        <w:t xml:space="preserve">que devolviese un proyectil que el motor de juego </w:t>
+      </w:r>
+      <w:r>
+        <w:t>debe</w:t>
+      </w:r>
+      <w:r>
+        <w:t xml:space="preserve"> interpretar</w:t>
+      </w:r>
+      <w:r>
+        <w:t>.</w:t>
+      </w:r>
+    </w:p>
+    <w:p>
+      <w:pPr>
+        <w:ind w:left="708"/>
+      </w:pPr>
+      <w:r>
+        <w:t xml:space="preserve">Por </w:t>
+      </w:r>
+      <w:r>
+        <w:t>último,</w:t>
+      </w:r>
+      <w:r>
+        <w:t xml:space="preserve"> solo me queda mencionar los cambios en las colisiones</w:t>
+      </w:r>
+      <w:r>
+        <w:t>, donde tuve que pasar a comprobar que</w:t>
+      </w:r>
+      <w:r>
+        <w:t xml:space="preserve"> el proyectil no dañase al actor que lo dispara</w:t>
+      </w:r>
+      <w:r>
+        <w:t xml:space="preserve">, además de añadir las comprobaciones para Player – </w:t>
+      </w:r>
+      <w:proofErr w:type="spellStart"/>
+      <w:r>
+        <w:t>Projectile</w:t>
+      </w:r>
+      <w:proofErr w:type="spellEnd"/>
+      <w:r>
+        <w:t>. Y</w:t>
+      </w:r>
+      <w:r>
+        <w:t xml:space="preserve"> el </w:t>
+      </w:r>
+      <w:r>
+        <w:t xml:space="preserve">ajuste del </w:t>
+      </w:r>
+      <w:proofErr w:type="spellStart"/>
+      <w:r>
+        <w:t>update</w:t>
+      </w:r>
+      <w:proofErr w:type="spellEnd"/>
+      <w:r>
+        <w:t xml:space="preserve"> de </w:t>
+      </w:r>
+      <w:proofErr w:type="spellStart"/>
+      <w:r>
+        <w:t>GameLayer</w:t>
+      </w:r>
+      <w:proofErr w:type="spellEnd"/>
+      <w:r>
+        <w:t>, que ahora recoge los disparos de los enemigos</w:t>
+      </w:r>
+      <w:r>
+        <w:t>:</w:t>
+      </w:r>
+      <w:r>
+        <w:br/>
+      </w:r>
+      <w:r>
+        <w:rPr>
+          <w:noProof/>
+        </w:rPr>
+        <w:drawing>
+          <wp:inline distT="0" distB="0" distL="0" distR="0" wp14:anchorId="07C63B37" wp14:editId="5CE54C64">
+            <wp:extent cx="5400040" cy="1313815"/>
+            <wp:effectExtent l="0" t="0" r="0" b="635"/>
+            <wp:docPr id="1611374225" name="Imagen 1"/>
+            <wp:cNvGraphicFramePr>
+              <a:graphicFrameLocks xmlns:a="http://schemas.openxmlformats.org/drawingml/2006/main" noChangeAspect="1"/>
+            </wp:cNvGraphicFramePr>
+            <a:graphic xmlns:a="http://schemas.openxmlformats.org/drawingml/2006/main">
+              <a:graphicData uri="http://schemas.openxmlformats.org/drawingml/2006/picture">
+                <pic:pic xmlns:pic="http://schemas.openxmlformats.org/drawingml/2006/picture">
+                  <pic:nvPicPr>
+                    <pic:cNvPr id="1611374225" name=""/>
+                    <pic:cNvPicPr/>
+                  </pic:nvPicPr>
+                  <pic:blipFill>
+                    <a:blip r:embed="rId17"/>
+                    <a:stretch>
+                      <a:fillRect/>
+                    </a:stretch>
+                  </pic:blipFill>
+                  <pic:spPr>
+                    <a:xfrm>
+                      <a:off x="0" y="0"/>
+                      <a:ext cx="5400040" cy="1313815"/>
+                    </a:xfrm>
+                    <a:prstGeom prst="rect">
+                      <a:avLst/>
+                    </a:prstGeom>
+                  </pic:spPr>
+                </pic:pic>
+              </a:graphicData>
+            </a:graphic>
+          </wp:inline>
+        </w:drawing>
+      </w:r>
+      <w:r>
+        <w:br/>
+      </w:r>
+      <w:r>
+        <w:rPr>
+          <w:noProof/>
+        </w:rPr>
+        <w:drawing>
+          <wp:inline distT="0" distB="0" distL="0" distR="0" wp14:anchorId="1FD31F9E" wp14:editId="0170B2CA">
+            <wp:extent cx="4543425" cy="1352550"/>
+            <wp:effectExtent l="0" t="0" r="9525" b="0"/>
+            <wp:docPr id="2126126299" name="Imagen 1"/>
+            <wp:cNvGraphicFramePr>
+              <a:graphicFrameLocks xmlns:a="http://schemas.openxmlformats.org/drawingml/2006/main" noChangeAspect="1"/>
+            </wp:cNvGraphicFramePr>
+            <a:graphic xmlns:a="http://schemas.openxmlformats.org/drawingml/2006/main">
+              <a:graphicData uri="http://schemas.openxmlformats.org/drawingml/2006/picture">
+                <pic:pic xmlns:pic="http://schemas.openxmlformats.org/drawingml/2006/picture">
+                  <pic:nvPicPr>
+                    <pic:cNvPr id="2126126299" name=""/>
+                    <pic:cNvPicPr/>
+                  </pic:nvPicPr>
+                  <pic:blipFill>
+                    <a:blip r:embed="rId18"/>
+                    <a:stretch>
+                      <a:fillRect/>
+                    </a:stretch>
+                  </pic:blipFill>
+                  <pic:spPr>
+                    <a:xfrm>
+                      <a:off x="0" y="0"/>
+                      <a:ext cx="4543425" cy="1352550"/>
+                    </a:xfrm>
+                    <a:prstGeom prst="rect">
+                      <a:avLst/>
+                    </a:prstGeom>
+                  </pic:spPr>
+                </pic:pic>
+              </a:graphicData>
+            </a:graphic>
+          </wp:inline>
+        </w:drawing>
+      </w:r>
+    </w:p>
+    <w:p>
+      <w:pPr>
+        <w:ind w:left="708"/>
+      </w:pPr>
+    </w:p>
+    <w:p>
+      <w:pPr>
+        <w:ind w:left="708"/>
+      </w:pPr>
+      <w:r>
+        <w:t>A mayores me gustaría comentar</w:t>
+      </w:r>
+      <w:r>
+        <w:t xml:space="preserve"> que solo permití que los enemigos comunes disparasen, para aportarle algo de variedad al juego.</w:t>
+      </w:r>
+      <w:r>
+        <w:t xml:space="preserve"> Aunque sería muy sencillo de cambiar</w:t>
+      </w:r>
+      <w:r>
+        <w:t xml:space="preserve"> para que los especiales o cualquier enemigo añadido tuviese esta facultad.</w:t>
+      </w:r>
+    </w:p>
+    <w:p>
+      <w:pPr>
+        <w:ind w:left="708"/>
+        <w:rPr>
+          <w:rFonts w:asciiTheme="majorHAnsi" w:eastAsiaTheme="majorEastAsia" w:hAnsiTheme="majorHAnsi" w:cstheme="majorBidi"/>
+          <w:color w:val="0F4761" w:themeColor="accent1" w:themeShade="BF"/>
+          <w:sz w:val="40"/>
+          <w:szCs w:val="40"/>
+        </w:rPr>
+      </w:pPr>
+      <w:r>
+        <w:rPr>
+          <w:highlight w:val="lightGray"/>
+        </w:rPr>
+        <w:br w:type="page"/>
+      </w:r>
+    </w:p>
+    <w:p>
+      <w:pPr>
+        <w:pStyle w:val="Ttulo1"/>
+        <w:numPr>
+          <w:ilvl w:val="0"/>
+          <w:numId w:val="6"/>
+        </w:numPr>
+      </w:pPr>
+      <w:r>
+        <w:lastRenderedPageBreak/>
+        <w:t>Jugador con Vida</w:t>
+      </w:r>
+      <w:bookmarkEnd w:id="2"/>
+    </w:p>
+    <w:p>
+      <w:pPr>
+        <w:ind w:left="708"/>
+      </w:pPr>
+      <w:r>
+        <w:t xml:space="preserve">Para implementar las vidas opté por guardar la variable </w:t>
+      </w:r>
+      <w:proofErr w:type="spellStart"/>
+      <w:r>
+        <w:t>lives</w:t>
+      </w:r>
+      <w:proofErr w:type="spellEnd"/>
+      <w:r>
+        <w:t xml:space="preserve"> dentro de Player, ya que considero que es un dato que atañe principalmente al jugador. Y </w:t>
+      </w:r>
+      <w:proofErr w:type="spellStart"/>
+      <w:r>
+        <w:t>GameLayer</w:t>
+      </w:r>
+      <w:proofErr w:type="spellEnd"/>
+      <w:r>
+        <w:t xml:space="preserve"> trabaja con él para representar el número de vidas, el cual se muestra no con un contador</w:t>
+      </w:r>
+      <w:r>
+        <w:t>,</w:t>
+      </w:r>
+      <w:r>
+        <w:t xml:space="preserve"> sino como 3 </w:t>
+      </w:r>
+      <w:proofErr w:type="spellStart"/>
+      <w:r>
+        <w:t>s</w:t>
+      </w:r>
+      <w:r>
+        <w:t>prites</w:t>
+      </w:r>
+      <w:proofErr w:type="spellEnd"/>
+      <w:r>
+        <w:t xml:space="preserve"> en pantalla.</w:t>
+      </w:r>
+    </w:p>
+    <w:p>
+      <w:pPr>
+        <w:ind w:left="708"/>
+      </w:pPr>
+      <w:r>
+        <w:t>Principalmente este ejercicio consistía en modificar el apartado de colisiones para hacer que cualquier acción que nos pudiese hacer daño pase a restarnos una vida</w:t>
+      </w:r>
+      <w:r>
+        <w:t xml:space="preserve"> y quitar un</w:t>
+      </w:r>
+      <w:r>
+        <w:t xml:space="preserve"> </w:t>
+      </w:r>
+      <w:proofErr w:type="spellStart"/>
+      <w:r>
+        <w:t>sprite</w:t>
+      </w:r>
+      <w:proofErr w:type="spellEnd"/>
+      <w:r>
+        <w:t xml:space="preserve"> </w:t>
+      </w:r>
+      <w:r>
+        <w:t>de la lista</w:t>
+      </w:r>
+      <w:r>
+        <w:t xml:space="preserve"> que guarda la representación visual </w:t>
+      </w:r>
+      <w:r>
+        <w:t>de las vidas</w:t>
+      </w:r>
+      <w:r>
+        <w:t>. Dejando así el reinicio del juego para</w:t>
+      </w:r>
+      <w:r>
+        <w:t xml:space="preserve"> cuando el número llegue a 0</w:t>
+      </w:r>
+      <w:r>
+        <w:t>:</w:t>
+      </w:r>
+      <w:r>
+        <w:br/>
+      </w:r>
+      <w:r>
+        <w:rPr>
+          <w:noProof/>
+        </w:rPr>
+        <w:drawing>
+          <wp:inline distT="0" distB="0" distL="0" distR="0" wp14:anchorId="02D22558" wp14:editId="4DC70B51">
+            <wp:extent cx="5240597" cy="1419225"/>
+            <wp:effectExtent l="0" t="0" r="0" b="0"/>
+            <wp:docPr id="1178158973" name="Imagen 1"/>
+            <wp:cNvGraphicFramePr>
+              <a:graphicFrameLocks xmlns:a="http://schemas.openxmlformats.org/drawingml/2006/main" noChangeAspect="1"/>
+            </wp:cNvGraphicFramePr>
+            <a:graphic xmlns:a="http://schemas.openxmlformats.org/drawingml/2006/main">
+              <a:graphicData uri="http://schemas.openxmlformats.org/drawingml/2006/picture">
+                <pic:pic xmlns:pic="http://schemas.openxmlformats.org/drawingml/2006/picture">
+                  <pic:nvPicPr>
+                    <pic:cNvPr id="1178158973" name=""/>
+                    <pic:cNvPicPr/>
+                  </pic:nvPicPr>
+                  <pic:blipFill>
+                    <a:blip r:embed="rId19"/>
+                    <a:stretch>
+                      <a:fillRect/>
+                    </a:stretch>
+                  </pic:blipFill>
+                  <pic:spPr>
+                    <a:xfrm>
+                      <a:off x="0" y="0"/>
+                      <a:ext cx="5256419" cy="1423510"/>
+                    </a:xfrm>
+                    <a:prstGeom prst="rect">
+                      <a:avLst/>
+                    </a:prstGeom>
+                  </pic:spPr>
+                </pic:pic>
+              </a:graphicData>
+            </a:graphic>
+          </wp:inline>
+        </w:drawing>
+      </w:r>
+      <w:r>
+        <w:br/>
+      </w:r>
+      <w:r>
+        <w:rPr>
+          <w:noProof/>
+        </w:rPr>
+        <w:drawing>
+          <wp:inline distT="0" distB="0" distL="0" distR="0" wp14:anchorId="49DC8980" wp14:editId="37C3F4E1">
+            <wp:extent cx="5314078" cy="1295400"/>
+            <wp:effectExtent l="0" t="0" r="1270" b="0"/>
+            <wp:docPr id="2033614236" name="Imagen 1"/>
+            <wp:cNvGraphicFramePr>
+              <a:graphicFrameLocks xmlns:a="http://schemas.openxmlformats.org/drawingml/2006/main" noChangeAspect="1"/>
+            </wp:cNvGraphicFramePr>
+            <a:graphic xmlns:a="http://schemas.openxmlformats.org/drawingml/2006/main">
+              <a:graphicData uri="http://schemas.openxmlformats.org/drawingml/2006/picture">
+                <pic:pic xmlns:pic="http://schemas.openxmlformats.org/drawingml/2006/picture">
+                  <pic:nvPicPr>
+                    <pic:cNvPr id="2033614236" name=""/>
+                    <pic:cNvPicPr/>
+                  </pic:nvPicPr>
+                  <pic:blipFill>
+                    <a:blip r:embed="rId20"/>
+                    <a:stretch>
+                      <a:fillRect/>
+                    </a:stretch>
+                  </pic:blipFill>
+                  <pic:spPr>
+                    <a:xfrm>
+                      <a:off x="0" y="0"/>
+                      <a:ext cx="5340687" cy="1301886"/>
+                    </a:xfrm>
+                    <a:prstGeom prst="rect">
+                      <a:avLst/>
+                    </a:prstGeom>
+                  </pic:spPr>
+                </pic:pic>
+              </a:graphicData>
+            </a:graphic>
+          </wp:inline>
+        </w:drawing>
+      </w:r>
+      <w:r>
+        <w:br/>
+      </w:r>
+      <w:r>
+        <w:rPr>
+          <w:noProof/>
+        </w:rPr>
+        <w:drawing>
+          <wp:inline distT="0" distB="0" distL="0" distR="0" wp14:anchorId="433A8C87" wp14:editId="7C45B370">
+            <wp:extent cx="2837156" cy="828675"/>
+            <wp:effectExtent l="0" t="0" r="1905" b="0"/>
+            <wp:docPr id="1824186062" name="Imagen 1"/>
+            <wp:cNvGraphicFramePr>
+              <a:graphicFrameLocks xmlns:a="http://schemas.openxmlformats.org/drawingml/2006/main" noChangeAspect="1"/>
+            </wp:cNvGraphicFramePr>
+            <a:graphic xmlns:a="http://schemas.openxmlformats.org/drawingml/2006/main">
+              <a:graphicData uri="http://schemas.openxmlformats.org/drawingml/2006/picture">
+                <pic:pic xmlns:pic="http://schemas.openxmlformats.org/drawingml/2006/picture">
+                  <pic:nvPicPr>
+                    <pic:cNvPr id="1824186062" name=""/>
+                    <pic:cNvPicPr/>
+                  </pic:nvPicPr>
+                  <pic:blipFill>
+                    <a:blip r:embed="rId21"/>
+                    <a:stretch>
+                      <a:fillRect/>
+                    </a:stretch>
+                  </pic:blipFill>
+                  <pic:spPr>
+                    <a:xfrm>
+                      <a:off x="0" y="0"/>
+                      <a:ext cx="2865260" cy="836884"/>
+                    </a:xfrm>
+                    <a:prstGeom prst="rect">
+                      <a:avLst/>
+                    </a:prstGeom>
+                  </pic:spPr>
+                </pic:pic>
+              </a:graphicData>
+            </a:graphic>
+          </wp:inline>
+        </w:drawing>
+      </w:r>
+    </w:p>
+    <w:p>
+      <w:pPr>
+        <w:ind w:left="708"/>
+      </w:pPr>
+      <w:r>
+        <w:br/>
+      </w:r>
+      <w:r>
+        <w:t>Además</w:t>
+      </w:r>
+      <w:r>
+        <w:t xml:space="preserve">, </w:t>
+      </w:r>
+      <w:r>
+        <w:t xml:space="preserve">para evitar perder todas las vidas de golpe tenemos que hacer que el objeto que impacta con el jugador sea borrado en ese mismo </w:t>
+      </w:r>
+      <w:proofErr w:type="spellStart"/>
+      <w:proofErr w:type="gramStart"/>
+      <w:r>
+        <w:t>frame</w:t>
+      </w:r>
+      <w:proofErr w:type="spellEnd"/>
+      <w:proofErr w:type="gramEnd"/>
+      <w:r>
+        <w:t>.</w:t>
+      </w:r>
+    </w:p>
+    <w:p>
+      <w:pPr>
+        <w:ind w:left="708"/>
+      </w:pPr>
+      <w:r>
+        <w:t>Para</w:t>
+      </w:r>
+      <w:r>
+        <w:t xml:space="preserve"> </w:t>
+      </w:r>
+      <w:r>
+        <w:t xml:space="preserve">terminar, para </w:t>
+      </w:r>
+      <w:r>
+        <w:t>mostrar</w:t>
+      </w:r>
+      <w:r>
+        <w:t xml:space="preserve"> al jugador la información</w:t>
+      </w:r>
+      <w:r>
+        <w:t xml:space="preserve"> tenemos </w:t>
+      </w:r>
+      <w:r>
+        <w:t>que crear la</w:t>
+      </w:r>
+      <w:r>
+        <w:t xml:space="preserve"> inicialización</w:t>
+      </w:r>
+      <w:r>
+        <w:t xml:space="preserve"> de la lista </w:t>
+      </w:r>
+      <w:proofErr w:type="spellStart"/>
+      <w:r>
+        <w:t>lives</w:t>
+      </w:r>
+      <w:proofErr w:type="spellEnd"/>
+      <w:r>
+        <w:t xml:space="preserve"> (primera imagen) y la inicialización del programa</w:t>
+      </w:r>
+      <w:r>
+        <w:t xml:space="preserve"> (segunda)</w:t>
+      </w:r>
+      <w:r>
+        <w:t>:</w:t>
+      </w:r>
+      <w:r>
+        <w:br/>
+      </w:r>
+      <w:r>
+        <w:rPr>
+          <w:noProof/>
+        </w:rPr>
+        <w:lastRenderedPageBreak/>
+        <w:drawing>
+          <wp:inline distT="0" distB="0" distL="0" distR="0" wp14:anchorId="6F75CF05" wp14:editId="1C6105CE">
+            <wp:extent cx="3667125" cy="1293859"/>
+            <wp:effectExtent l="0" t="0" r="0" b="1905"/>
+            <wp:docPr id="533139828" name="Imagen 1"/>
+            <wp:cNvGraphicFramePr>
+              <a:graphicFrameLocks xmlns:a="http://schemas.openxmlformats.org/drawingml/2006/main" noChangeAspect="1"/>
+            </wp:cNvGraphicFramePr>
+            <a:graphic xmlns:a="http://schemas.openxmlformats.org/drawingml/2006/main">
+              <a:graphicData uri="http://schemas.openxmlformats.org/drawingml/2006/picture">
+                <pic:pic xmlns:pic="http://schemas.openxmlformats.org/drawingml/2006/picture">
+                  <pic:nvPicPr>
+                    <pic:cNvPr id="533139828" name=""/>
+                    <pic:cNvPicPr/>
+                  </pic:nvPicPr>
+                  <pic:blipFill>
+                    <a:blip r:embed="rId22"/>
+                    <a:stretch>
+                      <a:fillRect/>
+                    </a:stretch>
+                  </pic:blipFill>
+                  <pic:spPr>
+                    <a:xfrm>
+                      <a:off x="0" y="0"/>
+                      <a:ext cx="3678020" cy="1297703"/>
+                    </a:xfrm>
+                    <a:prstGeom prst="rect">
+                      <a:avLst/>
+                    </a:prstGeom>
+                  </pic:spPr>
+                </pic:pic>
+              </a:graphicData>
+            </a:graphic>
+          </wp:inline>
+        </w:drawing>
+      </w:r>
+      <w:r>
+        <w:br/>
+      </w:r>
+      <w:r>
+        <w:rPr>
+          <w:noProof/>
+        </w:rPr>
+        <w:drawing>
+          <wp:inline distT="0" distB="0" distL="0" distR="0" wp14:anchorId="25570D22" wp14:editId="34298612">
+            <wp:extent cx="2924175" cy="737327"/>
+            <wp:effectExtent l="0" t="0" r="0" b="5715"/>
+            <wp:docPr id="1225139884" name="Imagen 1"/>
+            <wp:cNvGraphicFramePr>
+              <a:graphicFrameLocks xmlns:a="http://schemas.openxmlformats.org/drawingml/2006/main" noChangeAspect="1"/>
+            </wp:cNvGraphicFramePr>
+            <a:graphic xmlns:a="http://schemas.openxmlformats.org/drawingml/2006/main">
+              <a:graphicData uri="http://schemas.openxmlformats.org/drawingml/2006/picture">
+                <pic:pic xmlns:pic="http://schemas.openxmlformats.org/drawingml/2006/picture">
+                  <pic:nvPicPr>
+                    <pic:cNvPr id="1225139884" name=""/>
+                    <pic:cNvPicPr/>
+                  </pic:nvPicPr>
+                  <pic:blipFill>
+                    <a:blip r:embed="rId23"/>
+                    <a:stretch>
+                      <a:fillRect/>
+                    </a:stretch>
+                  </pic:blipFill>
+                  <pic:spPr>
+                    <a:xfrm>
+                      <a:off x="0" y="0"/>
+                      <a:ext cx="2934710" cy="739983"/>
+                    </a:xfrm>
+                    <a:prstGeom prst="rect">
+                      <a:avLst/>
+                    </a:prstGeom>
+                  </pic:spPr>
+                </pic:pic>
+              </a:graphicData>
+            </a:graphic>
+          </wp:inline>
+        </w:drawing>
+      </w:r>
+      <w:r>
+        <w:br w:type="page"/>
+      </w:r>
+    </w:p>
+    <w:p>
+      <w:pPr>
+        <w:pStyle w:val="Ttulo1"/>
+        <w:numPr>
+          <w:ilvl w:val="0"/>
+          <w:numId w:val="6"/>
+        </w:numPr>
+      </w:pPr>
+      <w:bookmarkStart w:id="3" w:name="_Toc241171326"/>
+      <w:r>
+        <w:lastRenderedPageBreak/>
+        <w:t>Cambio de Nave</w:t>
+      </w:r>
+      <w:bookmarkEnd w:id="3"/>
+    </w:p>
+    <w:p>
+      <w:pPr>
+        <w:pStyle w:val="Prrafodelista"/>
+      </w:pPr>
+      <w:r>
+        <w:t xml:space="preserve">Considero que la forma correcta de hacer este ejercicio sería crear una clase </w:t>
+      </w:r>
+      <w:proofErr w:type="spellStart"/>
+      <w:r>
+        <w:t>SpaceShip</w:t>
+      </w:r>
+      <w:proofErr w:type="spellEnd"/>
+      <w:r>
+        <w:t xml:space="preserve"> que estuviese conectada a Player y que alternase entre ambas naves independientes. Este enfoque </w:t>
+      </w:r>
+      <w:r>
+        <w:t>es</w:t>
+      </w:r>
+      <w:r>
+        <w:t xml:space="preserve"> muy flexible y altamente extensible, pero no lo hice así. Por simplicidad creé un método que cambia los valores justos y necesarios dentro de </w:t>
+      </w:r>
+      <w:proofErr w:type="spellStart"/>
+      <w:r>
+        <w:t>player</w:t>
+      </w:r>
+      <w:proofErr w:type="spellEnd"/>
+      <w:r>
+        <w:t xml:space="preserve"> para gestionarlo:</w:t>
+      </w:r>
+      <w:r>
+        <w:br/>
+      </w:r>
+      <w:r>
+        <w:rPr>
+          <w:noProof/>
+        </w:rPr>
+        <w:drawing>
+          <wp:inline distT="0" distB="0" distL="0" distR="0" wp14:anchorId="56A9474D" wp14:editId="1C6698DE">
+            <wp:extent cx="5400040" cy="2946400"/>
+            <wp:effectExtent l="0" t="0" r="0" b="6350"/>
+            <wp:docPr id="325684454" name="Imagen 1"/>
+            <wp:cNvGraphicFramePr>
+              <a:graphicFrameLocks xmlns:a="http://schemas.openxmlformats.org/drawingml/2006/main" noChangeAspect="1"/>
+            </wp:cNvGraphicFramePr>
+            <a:graphic xmlns:a="http://schemas.openxmlformats.org/drawingml/2006/main">
+              <a:graphicData uri="http://schemas.openxmlformats.org/drawingml/2006/picture">
+                <pic:pic xmlns:pic="http://schemas.openxmlformats.org/drawingml/2006/picture">
+                  <pic:nvPicPr>
+                    <pic:cNvPr id="325684454" name=""/>
+                    <pic:cNvPicPr/>
+                  </pic:nvPicPr>
+                  <pic:blipFill>
+                    <a:blip r:embed="rId24"/>
+                    <a:stretch>
+                      <a:fillRect/>
+                    </a:stretch>
+                  </pic:blipFill>
+                  <pic:spPr>
+                    <a:xfrm>
+                      <a:off x="0" y="0"/>
+                      <a:ext cx="5400040" cy="2946400"/>
+                    </a:xfrm>
+                    <a:prstGeom prst="rect">
+                      <a:avLst/>
+                    </a:prstGeom>
+                  </pic:spPr>
+                </pic:pic>
+              </a:graphicData>
+            </a:graphic>
+          </wp:inline>
+        </w:drawing>
+      </w:r>
+    </w:p>
+    <w:p>
+      <w:pPr>
+        <w:pStyle w:val="Prrafodelista"/>
+      </w:pPr>
+      <w:r>
+        <w:t xml:space="preserve">Puede verse que he empleado una variable </w:t>
+      </w:r>
+      <w:proofErr w:type="spellStart"/>
+      <w:r>
+        <w:t>spaceship</w:t>
+      </w:r>
+      <w:proofErr w:type="spellEnd"/>
+      <w:r>
+        <w:t xml:space="preserve"> que nos dice con qué nave estamos, para que no ejecute la operación si ya estamos con esa nave.</w:t>
+      </w:r>
+    </w:p>
+    <w:p>
+      <w:pPr>
+        <w:pStyle w:val="Prrafodelista"/>
+      </w:pPr>
+    </w:p>
+    <w:p>
+      <w:pPr>
+        <w:pStyle w:val="Prrafodelista"/>
+      </w:pPr>
+      <w:r>
+        <w:t xml:space="preserve">Para </w:t>
+      </w:r>
+      <w:r>
+        <w:t>terminar,</w:t>
+      </w:r>
+      <w:r>
+        <w:t xml:space="preserve"> teniendo todo esto solo me quedaba </w:t>
+      </w:r>
+      <w:r>
+        <w:t>que pudiese utilizarse creando un apartado en controles:</w:t>
+      </w:r>
+      <w:r>
+        <w:br/>
+      </w:r>
+      <w:r>
+        <w:rPr>
+          <w:noProof/>
+        </w:rPr>
+        <w:drawing>
+          <wp:inline distT="0" distB="0" distL="0" distR="0" wp14:anchorId="6E607EE9" wp14:editId="06F1A011">
+            <wp:extent cx="5076825" cy="1685925"/>
+            <wp:effectExtent l="0" t="0" r="9525" b="9525"/>
+            <wp:docPr id="734100908" name="Imagen 1"/>
+            <wp:cNvGraphicFramePr>
+              <a:graphicFrameLocks xmlns:a="http://schemas.openxmlformats.org/drawingml/2006/main" noChangeAspect="1"/>
+            </wp:cNvGraphicFramePr>
+            <a:graphic xmlns:a="http://schemas.openxmlformats.org/drawingml/2006/main">
+              <a:graphicData uri="http://schemas.openxmlformats.org/drawingml/2006/picture">
+                <pic:pic xmlns:pic="http://schemas.openxmlformats.org/drawingml/2006/picture">
+                  <pic:nvPicPr>
+                    <pic:cNvPr id="734100908" name=""/>
+                    <pic:cNvPicPr/>
+                  </pic:nvPicPr>
+                  <pic:blipFill>
+                    <a:blip r:embed="rId25"/>
+                    <a:stretch>
+                      <a:fillRect/>
+                    </a:stretch>
+                  </pic:blipFill>
+                  <pic:spPr>
+                    <a:xfrm>
+                      <a:off x="0" y="0"/>
+                      <a:ext cx="5076825" cy="1685925"/>
+                    </a:xfrm>
+                    <a:prstGeom prst="rect">
+                      <a:avLst/>
+                    </a:prstGeom>
+                  </pic:spPr>
+                </pic:pic>
+              </a:graphicData>
+            </a:graphic>
+          </wp:inline>
+        </w:drawing>
+      </w:r>
+    </w:p>
+    <w:p>
+      <w:pPr>
+        <w:pStyle w:val="Prrafodelista"/>
+      </w:pPr>
+    </w:p>
+    <w:p>
+      <w:pPr>
+        <w:rPr>
+          <w:rFonts w:asciiTheme="majorHAnsi" w:eastAsiaTheme="majorEastAsia" w:hAnsiTheme="majorHAnsi" w:cstheme="majorBidi"/>
+          <w:color w:val="0F4761" w:themeColor="accent1" w:themeShade="BF"/>
+          <w:sz w:val="40"/>
+          <w:szCs w:val="40"/>
+        </w:rPr>
+      </w:pPr>
+      <w:bookmarkStart w:id="4" w:name="_Toc241171327"/>
+      <w:r>
+        <w:br w:type="page"/>
+      </w:r>
+    </w:p>
+    <w:p>
+      <w:pPr>
+        <w:pStyle w:val="Ttulo1"/>
+        <w:ind w:firstLine="360"/>
+      </w:pPr>
+      <w:r>
+        <w:lastRenderedPageBreak/>
+        <w:t>9</w:t>
+      </w:r>
+      <w:r>
+        <w:t xml:space="preserve">. </w:t>
+      </w:r>
+      <w:r>
+        <w:t>Disparo especial</w:t>
+      </w:r>
+      <w:bookmarkEnd w:id="4"/>
+    </w:p>
+    <w:p>
+      <w:pPr>
+        <w:ind w:left="705"/>
+      </w:pPr>
+      <w:r>
+        <w:t>Para la implementación de este tipo de</w:t>
+      </w:r>
+      <w:r>
+        <w:t xml:space="preserve">l disparo especial decidí crear una clase base </w:t>
+      </w:r>
+      <w:proofErr w:type="spellStart"/>
+      <w:r>
+        <w:t>PowerUp</w:t>
+      </w:r>
+      <w:proofErr w:type="spellEnd"/>
+      <w:r>
+        <w:t xml:space="preserve"> </w:t>
+      </w:r>
+      <w:r>
+        <w:t xml:space="preserve">para </w:t>
+      </w:r>
+      <w:r>
+        <w:t>poder manejar en conjunto todas las mejoras del juego:</w:t>
+      </w:r>
+      <w:r>
+        <w:br/>
+      </w:r>
+      <w:r>
+        <w:rPr>
+          <w:noProof/>
+        </w:rPr>
+        <w:drawing>
+          <wp:inline distT="0" distB="0" distL="0" distR="0" wp14:anchorId="64273135" wp14:editId="435A67A4">
+            <wp:extent cx="5400040" cy="3465195"/>
+            <wp:effectExtent l="0" t="0" r="0" b="1905"/>
+            <wp:docPr id="1440752898" name="Imagen 1"/>
+            <wp:cNvGraphicFramePr>
+              <a:graphicFrameLocks xmlns:a="http://schemas.openxmlformats.org/drawingml/2006/main" noChangeAspect="1"/>
+            </wp:cNvGraphicFramePr>
+            <a:graphic xmlns:a="http://schemas.openxmlformats.org/drawingml/2006/main">
+              <a:graphicData uri="http://schemas.openxmlformats.org/drawingml/2006/picture">
+                <pic:pic xmlns:pic="http://schemas.openxmlformats.org/drawingml/2006/picture">
+                  <pic:nvPicPr>
+                    <pic:cNvPr id="1440752898" name=""/>
+                    <pic:cNvPicPr/>
+                  </pic:nvPicPr>
+                  <pic:blipFill>
+                    <a:blip r:embed="rId26"/>
+                    <a:stretch>
+                      <a:fillRect/>
+                    </a:stretch>
+                  </pic:blipFill>
+                  <pic:spPr>
+                    <a:xfrm>
+                      <a:off x="0" y="0"/>
+                      <a:ext cx="5400040" cy="3465195"/>
+                    </a:xfrm>
+                    <a:prstGeom prst="rect">
+                      <a:avLst/>
+                    </a:prstGeom>
+                  </pic:spPr>
+                </pic:pic>
+              </a:graphicData>
+            </a:graphic>
+          </wp:inline>
+        </w:drawing>
+      </w:r>
+    </w:p>
+    <w:p>
+      <w:pPr>
+        <w:ind w:left="705"/>
+      </w:pPr>
+      <w:r>
+        <w:tab/>
+        <w:t xml:space="preserve">A </w:t>
+      </w:r>
+      <w:r>
+        <w:t>continuación,</w:t>
+      </w:r>
+      <w:r>
+        <w:t xml:space="preserve"> desarroll</w:t>
+      </w:r>
+      <w:r>
+        <w:t>é</w:t>
+      </w:r>
+      <w:r>
+        <w:t xml:space="preserve"> la clase hija, encargada del disparo más rápido:</w:t>
+      </w:r>
+      <w:r>
+        <w:br/>
+      </w:r>
+      <w:r>
+        <w:rPr>
+          <w:noProof/>
+        </w:rPr>
+        <w:drawing>
+          <wp:inline distT="0" distB="0" distL="0" distR="0" wp14:anchorId="400FF7F4" wp14:editId="397DE8F0">
+            <wp:extent cx="5400040" cy="2837180"/>
+            <wp:effectExtent l="0" t="0" r="0" b="1270"/>
+            <wp:docPr id="859879297" name="Imagen 1"/>
+            <wp:cNvGraphicFramePr>
+              <a:graphicFrameLocks xmlns:a="http://schemas.openxmlformats.org/drawingml/2006/main" noChangeAspect="1"/>
+            </wp:cNvGraphicFramePr>
+            <a:graphic xmlns:a="http://schemas.openxmlformats.org/drawingml/2006/main">
+              <a:graphicData uri="http://schemas.openxmlformats.org/drawingml/2006/picture">
+                <pic:pic xmlns:pic="http://schemas.openxmlformats.org/drawingml/2006/picture">
+                  <pic:nvPicPr>
+                    <pic:cNvPr id="859879297" name=""/>
+                    <pic:cNvPicPr/>
+                  </pic:nvPicPr>
+                  <pic:blipFill>
+                    <a:blip r:embed="rId27"/>
+                    <a:stretch>
+                      <a:fillRect/>
+                    </a:stretch>
+                  </pic:blipFill>
+                  <pic:spPr>
+                    <a:xfrm>
+                      <a:off x="0" y="0"/>
+                      <a:ext cx="5400040" cy="2837180"/>
+                    </a:xfrm>
+                    <a:prstGeom prst="rect">
+                      <a:avLst/>
+                    </a:prstGeom>
+                  </pic:spPr>
+                </pic:pic>
+              </a:graphicData>
+            </a:graphic>
+          </wp:inline>
+        </w:drawing>
+      </w:r>
+    </w:p>
+    <w:p>
+      <w:pPr>
+        <w:ind w:left="705"/>
+      </w:pPr>
+      <w:r>
+        <w:t xml:space="preserve">Gestionamos la colisión con el </w:t>
+      </w:r>
+      <w:proofErr w:type="spellStart"/>
+      <w:r>
+        <w:t>recogible</w:t>
+      </w:r>
+      <w:proofErr w:type="spellEnd"/>
+      <w:r>
+        <w:t xml:space="preserve"> usando el método </w:t>
+      </w:r>
+      <w:proofErr w:type="spellStart"/>
+      <w:r>
+        <w:t>applyEffect</w:t>
+      </w:r>
+      <w:proofErr w:type="spellEnd"/>
+      <w:r>
+        <w:t xml:space="preserve"> de </w:t>
+      </w:r>
+      <w:proofErr w:type="spellStart"/>
+      <w:r>
+        <w:t>powerUp</w:t>
+      </w:r>
+      <w:proofErr w:type="spellEnd"/>
+      <w:r>
+        <w:t>:</w:t>
+      </w:r>
+      <w:r>
+        <w:br/>
+      </w:r>
+      <w:r>
+        <w:rPr>
+          <w:noProof/>
+        </w:rPr>
+        <w:lastRenderedPageBreak/>
+        <w:drawing>
+          <wp:inline distT="0" distB="0" distL="0" distR="0" wp14:anchorId="09AA4AC8" wp14:editId="079F8E86">
+            <wp:extent cx="5400040" cy="1351280"/>
+            <wp:effectExtent l="0" t="0" r="0" b="1270"/>
+            <wp:docPr id="1788703458" name="Imagen 1"/>
+            <wp:cNvGraphicFramePr>
+              <a:graphicFrameLocks xmlns:a="http://schemas.openxmlformats.org/drawingml/2006/main" noChangeAspect="1"/>
+            </wp:cNvGraphicFramePr>
+            <a:graphic xmlns:a="http://schemas.openxmlformats.org/drawingml/2006/main">
+              <a:graphicData uri="http://schemas.openxmlformats.org/drawingml/2006/picture">
+                <pic:pic xmlns:pic="http://schemas.openxmlformats.org/drawingml/2006/picture">
+                  <pic:nvPicPr>
+                    <pic:cNvPr id="1788703458" name=""/>
+                    <pic:cNvPicPr/>
+                  </pic:nvPicPr>
+                  <pic:blipFill>
+                    <a:blip r:embed="rId28"/>
+                    <a:stretch>
+                      <a:fillRect/>
+                    </a:stretch>
+                  </pic:blipFill>
+                  <pic:spPr>
+                    <a:xfrm>
+                      <a:off x="0" y="0"/>
+                      <a:ext cx="5400040" cy="1351280"/>
+                    </a:xfrm>
+                    <a:prstGeom prst="rect">
+                      <a:avLst/>
+                    </a:prstGeom>
+                  </pic:spPr>
+                </pic:pic>
+              </a:graphicData>
+            </a:graphic>
+          </wp:inline>
+        </w:drawing>
+      </w:r>
+      <w:r>
+        <w:br/>
+        <w:t xml:space="preserve">Para cumplir con la especificación de que solo puede ser aplicado una vez tenemos una clase </w:t>
+      </w:r>
+      <w:proofErr w:type="spellStart"/>
+      <w:r>
+        <w:t>bool</w:t>
+      </w:r>
+      <w:proofErr w:type="spellEnd"/>
+      <w:r>
+        <w:t xml:space="preserve"> en Player que nos dice si el jugador tiene ya este efecto o no, para no volver a dárselo. </w:t>
+      </w:r>
+    </w:p>
+    <w:p>
+      <w:pPr>
+        <w:ind w:left="705"/>
+      </w:pPr>
+      <w:r>
+        <w:t xml:space="preserve">Y, por último, creamos un generador de </w:t>
+      </w:r>
+      <w:proofErr w:type="spellStart"/>
+      <w:r>
+        <w:t>power</w:t>
+      </w:r>
+      <w:r>
+        <w:t>U</w:t>
+      </w:r>
+      <w:r>
+        <w:t>ps</w:t>
+      </w:r>
+      <w:proofErr w:type="spellEnd"/>
+      <w:r>
+        <w:t>:</w:t>
+      </w:r>
+      <w:r>
+        <w:br/>
+      </w:r>
+      <w:r>
+        <w:rPr>
+          <w:noProof/>
+        </w:rPr>
+        <w:drawing>
+          <wp:inline distT="0" distB="0" distL="0" distR="0" wp14:anchorId="15DCE9A3" wp14:editId="56FBC0BF">
+            <wp:extent cx="4895850" cy="1781175"/>
+            <wp:effectExtent l="0" t="0" r="0" b="9525"/>
+            <wp:docPr id="1301938651" name="Imagen 1"/>
+            <wp:cNvGraphicFramePr>
+              <a:graphicFrameLocks xmlns:a="http://schemas.openxmlformats.org/drawingml/2006/main" noChangeAspect="1"/>
+            </wp:cNvGraphicFramePr>
+            <a:graphic xmlns:a="http://schemas.openxmlformats.org/drawingml/2006/main">
+              <a:graphicData uri="http://schemas.openxmlformats.org/drawingml/2006/picture">
+                <pic:pic xmlns:pic="http://schemas.openxmlformats.org/drawingml/2006/picture">
+                  <pic:nvPicPr>
+                    <pic:cNvPr id="1301938651" name=""/>
+                    <pic:cNvPicPr/>
+                  </pic:nvPicPr>
+                  <pic:blipFill>
+                    <a:blip r:embed="rId29"/>
+                    <a:stretch>
+                      <a:fillRect/>
+                    </a:stretch>
+                  </pic:blipFill>
+                  <pic:spPr>
+                    <a:xfrm>
+                      <a:off x="0" y="0"/>
+                      <a:ext cx="4895850" cy="1781175"/>
+                    </a:xfrm>
+                    <a:prstGeom prst="rect">
+                      <a:avLst/>
+                    </a:prstGeom>
+                  </pic:spPr>
+                </pic:pic>
+              </a:graphicData>
+            </a:graphic>
+          </wp:inline>
+        </w:drawing>
       </w:r>
     </w:p>
     <w:sectPr>
+      <w:footerReference w:type="default" r:id="rId30"/>
       <w:pgSz w:w="11906" w:h="16838"/>
       <w:pgMar w:top="1417" w:right="1701" w:bottom="1417" w:left="1701" w:header="708" w:footer="708" w:gutter="0"/>
+      <w:pgNumType w:start="0"/>
       <w:cols w:space="708"/>
+      <w:titlePg/>
       <w:docGrid w:linePitch="360"/>
     </w:sectPr>
   </w:body>
 </w:document>
+</file>
+
+<file path=word/endnotes.xml><?xml version="1.0" encoding="utf-8"?>
+<w:endnotes xmlns:wpc="http://schemas.microsoft.com/office/word/2010/wordprocessingCanvas" xmlns:cx="http://schemas.microsoft.com/office/drawing/2014/chartex" xmlns:cx1="http://schemas.microsoft.com/office/drawing/2015/9/8/chartex" xmlns:cx2="http://schemas.microsoft.com/office/drawing/2015/10/21/chartex" xmlns:cx3="http://schemas.microsoft.com/office/drawing/2016/5/9/chartex" xmlns:cx4="http://schemas.microsoft.com/office/drawing/2016/5/10/chartex" xmlns:cx5="http://schemas.microsoft.com/office/drawing/2016/5/11/chartex" xmlns:cx6="http://schemas.microsoft.com/office/drawing/2016/5/12/chartex" xmlns:cx7="http://schemas.microsoft.com/office/drawing/2016/5/13/chartex" xmlns:cx8="http://schemas.microsoft.com/office/drawing/2016/5/14/chartex" xmlns:mc="http://schemas.openxmlformats.org/markup-compatibility/2006" xmlns:aink="http://schemas.microsoft.com/office/drawing/2016/ink" xmlns:am3d="http://schemas.microsoft.com/office/drawing/2017/model3d" xmlns:o="urn:schemas-microsoft-com:office:office" xmlns:oel="http://schemas.microsoft.com/office/2019/extlst" xmlns:r="http://schemas.openxmlformats.org/officeDocument/2006/relationships" xmlns:m="http://schemas.openxmlformats.org/officeDocument/2006/math" xmlns:v="urn:schemas-microsoft-com:vml" xmlns:wp14="http://schemas.microsoft.com/office/word/2010/wordprocessingDrawing" xmlns:wp="http://schemas.openxmlformats.org/drawingml/2006/wordprocessingDrawing" xmlns:w10="urn:schemas-microsoft-com:office:word" xmlns:w="http://schemas.openxmlformats.org/wordprocessingml/2006/main" xmlns:w14="http://schemas.microsoft.com/office/word/2010/wordml" xmlns:w15="http://schemas.microsoft.com/office/word/2012/wordml" xmlns:w16cex="http://schemas.microsoft.com/office/word/2018/wordml/cex" xmlns:w16cid="http://schemas.microsoft.com/office/word/2016/wordml/cid" xmlns:w16="http://schemas.microsoft.com/office/word/2018/wordml" xmlns:w16du="http://schemas.microsoft.com/office/word/2023/wordml/word16du" xmlns:w16sdtdh="http://schemas.microsoft.com/office/word/2020/wordml/sdtdatahash" xmlns:w16sdtfl="http://schemas.microsoft.com/office/word/2024/wordml/sdtformatlock" xmlns:w16se="http://schemas.microsoft.com/office/word/2015/wordml/symex" xmlns:wpg="http://schemas.microsoft.com/office/word/2010/wordprocessingGroup" xmlns:wpi="http://schemas.microsoft.com/office/word/2010/wordprocessingInk" xmlns:wne="http://schemas.microsoft.com/office/word/2006/wordml" xmlns:wps="http://schemas.microsoft.com/office/word/2010/wordprocessingShape" mc:Ignorable="w14 w15 w16se w16cid w16 w16cex w16sdtdh w16sdtfl w16du wp14">
+  <w:endnote w:type="separator" w:id="-1">
+    <w:p>
+      <w:pPr>
+        <w:spacing w:after="0" w:line="240" w:lineRule="auto"/>
+      </w:pPr>
+      <w:r>
+        <w:separator/>
+      </w:r>
+    </w:p>
+  </w:endnote>
+  <w:endnote w:type="continuationSeparator" w:id="0">
+    <w:p>
+      <w:pPr>
+        <w:spacing w:after="0" w:line="240" w:lineRule="auto"/>
+      </w:pPr>
+      <w:r>
+        <w:continuationSeparator/>
+      </w:r>
+    </w:p>
+  </w:endnote>
+</w:endnotes>
+</file>
+
+<file path=word/footer1.xml><?xml version="1.0" encoding="utf-8"?>
+<w:ftr xmlns:wpc="http://schemas.microsoft.com/office/word/2010/wordprocessingCanvas" xmlns:cx="http://schemas.microsoft.com/office/drawing/2014/chartex" xmlns:cx1="http://schemas.microsoft.com/office/drawing/2015/9/8/chartex" xmlns:cx2="http://schemas.microsoft.com/office/drawing/2015/10/21/chartex" xmlns:cx3="http://schemas.microsoft.com/office/drawing/2016/5/9/chartex" xmlns:cx4="http://schemas.microsoft.com/office/drawing/2016/5/10/chartex" xmlns:cx5="http://schemas.microsoft.com/office/drawing/2016/5/11/chartex" xmlns:cx6="http://schemas.microsoft.com/office/drawing/2016/5/12/chartex" xmlns:cx7="http://schemas.microsoft.com/office/drawing/2016/5/13/chartex" xmlns:cx8="http://schemas.microsoft.com/office/drawing/2016/5/14/chartex" xmlns:mc="http://schemas.openxmlformats.org/markup-compatibility/2006" xmlns:aink="http://schemas.microsoft.com/office/drawing/2016/ink" xmlns:am3d="http://schemas.microsoft.com/office/drawing/2017/model3d" xmlns:o="urn:schemas-microsoft-com:office:office" xmlns:oel="http://schemas.microsoft.com/office/2019/extlst" xmlns:r="http://schemas.openxmlformats.org/officeDocument/2006/relationships" xmlns:m="http://schemas.openxmlformats.org/officeDocument/2006/math" xmlns:v="urn:schemas-microsoft-com:vml" xmlns:wp14="http://schemas.microsoft.com/office/word/2010/wordprocessingDrawing" xmlns:wp="http://schemas.openxmlformats.org/drawingml/2006/wordprocessingDrawing" xmlns:w10="urn:schemas-microsoft-com:office:word" xmlns:w="http://schemas.openxmlformats.org/wordprocessingml/2006/main" xmlns:w14="http://schemas.microsoft.com/office/word/2010/wordml" xmlns:w15="http://schemas.microsoft.com/office/word/2012/wordml" xmlns:w16cex="http://schemas.microsoft.com/office/word/2018/wordml/cex" xmlns:w16cid="http://schemas.microsoft.com/office/word/2016/wordml/cid" xmlns:w16="http://schemas.microsoft.com/office/word/2018/wordml" xmlns:w16du="http://schemas.microsoft.com/office/word/2023/wordml/word16du" xmlns:w16sdtdh="http://schemas.microsoft.com/office/word/2020/wordml/sdtdatahash" xmlns:w16sdtfl="http://schemas.microsoft.com/office/word/2024/wordml/sdtformatlock" xmlns:w16se="http://schemas.microsoft.com/office/word/2015/wordml/symex" xmlns:wpg="http://schemas.microsoft.com/office/word/2010/wordprocessingGroup" xmlns:wpi="http://schemas.microsoft.com/office/word/2010/wordprocessingInk" xmlns:wne="http://schemas.microsoft.com/office/word/2006/wordml" xmlns:wps="http://schemas.microsoft.com/office/word/2010/wordprocessingShape" mc:Ignorable="w14 w15 w16se w16cid w16 w16cex w16sdtdh w16sdtfl w16du wp14">
+  <w:p>
+    <w:pPr>
+      <w:pStyle w:val="Piedepgina"/>
+      <w:jc w:val="center"/>
+      <w:rPr>
+        <w:caps/>
+        <w:color w:val="156082" w:themeColor="accent1"/>
+      </w:rPr>
+    </w:pPr>
+    <w:r>
+      <w:rPr>
+        <w:caps/>
+        <w:color w:val="156082" w:themeColor="accent1"/>
+      </w:rPr>
+      <w:fldChar w:fldCharType="begin"/>
+    </w:r>
+    <w:r>
+      <w:rPr>
+        <w:caps/>
+        <w:color w:val="156082" w:themeColor="accent1"/>
+      </w:rPr>
+      <w:instrText>PAGE   \* MERGEFORMAT</w:instrText>
+    </w:r>
+    <w:r>
+      <w:rPr>
+        <w:caps/>
+        <w:color w:val="156082" w:themeColor="accent1"/>
+      </w:rPr>
+      <w:fldChar w:fldCharType="separate"/>
+    </w:r>
+    <w:r>
+      <w:rPr>
+        <w:caps/>
+        <w:color w:val="156082" w:themeColor="accent1"/>
+      </w:rPr>
+      <w:t>2</w:t>
+    </w:r>
+    <w:r>
+      <w:rPr>
+        <w:caps/>
+        <w:color w:val="156082" w:themeColor="accent1"/>
+      </w:rPr>
+      <w:fldChar w:fldCharType="end"/>
+    </w:r>
+  </w:p>
+  <w:p>
+    <w:pPr>
+      <w:pStyle w:val="Piedepgina"/>
+    </w:pPr>
+  </w:p>
+</w:ftr>
+</file>
+
+<file path=word/footnotes.xml><?xml version="1.0" encoding="utf-8"?>
+<w:footnotes xmlns:wpc="http://schemas.microsoft.com/office/word/2010/wordprocessingCanvas" xmlns:cx="http://schemas.microsoft.com/office/drawing/2014/chartex" xmlns:cx1="http://schemas.microsoft.com/office/drawing/2015/9/8/chartex" xmlns:cx2="http://schemas.microsoft.com/office/drawing/2015/10/21/chartex" xmlns:cx3="http://schemas.microsoft.com/office/drawing/2016/5/9/chartex" xmlns:cx4="http://schemas.microsoft.com/office/drawing/2016/5/10/chartex" xmlns:cx5="http://schemas.microsoft.com/office/drawing/2016/5/11/chartex" xmlns:cx6="http://schemas.microsoft.com/office/drawing/2016/5/12/chartex" xmlns:cx7="http://schemas.microsoft.com/office/drawing/2016/5/13/chartex" xmlns:cx8="http://schemas.microsoft.com/office/drawing/2016/5/14/chartex" xmlns:mc="http://schemas.openxmlformats.org/markup-compatibility/2006" xmlns:aink="http://schemas.microsoft.com/office/drawing/2016/ink" xmlns:am3d="http://schemas.microsoft.com/office/drawing/2017/model3d" xmlns:o="urn:schemas-microsoft-com:office:office" xmlns:oel="http://schemas.microsoft.com/office/2019/extlst" xmlns:r="http://schemas.openxmlformats.org/officeDocument/2006/relationships" xmlns:m="http://schemas.openxmlformats.org/officeDocument/2006/math" xmlns:v="urn:schemas-microsoft-com:vml" xmlns:wp14="http://schemas.microsoft.com/office/word/2010/wordprocessingDrawing" xmlns:wp="http://schemas.openxmlformats.org/drawingml/2006/wordprocessingDrawing" xmlns:w10="urn:schemas-microsoft-com:office:word" xmlns:w="http://schemas.openxmlformats.org/wordprocessingml/2006/main" xmlns:w14="http://schemas.microsoft.com/office/word/2010/wordml" xmlns:w15="http://schemas.microsoft.com/office/word/2012/wordml" xmlns:w16cex="http://schemas.microsoft.com/office/word/2018/wordml/cex" xmlns:w16cid="http://schemas.microsoft.com/office/word/2016/wordml/cid" xmlns:w16="http://schemas.microsoft.com/office/word/2018/wordml" xmlns:w16du="http://schemas.microsoft.com/office/word/2023/wordml/word16du" xmlns:w16sdtdh="http://schemas.microsoft.com/office/word/2020/wordml/sdtdatahash" xmlns:w16sdtfl="http://schemas.microsoft.com/office/word/2024/wordml/sdtformatlock" xmlns:w16se="http://schemas.microsoft.com/office/word/2015/wordml/symex" xmlns:wpg="http://schemas.microsoft.com/office/word/2010/wordprocessingGroup" xmlns:wpi="http://schemas.microsoft.com/office/word/2010/wordprocessingInk" xmlns:wne="http://schemas.microsoft.com/office/word/2006/wordml" xmlns:wps="http://schemas.microsoft.com/office/word/2010/wordprocessingShape" mc:Ignorable="w14 w15 w16se w16cid w16 w16cex w16sdtdh w16sdtfl w16du wp14">
+  <w:footnote w:type="separator" w:id="-1">
+    <w:p>
+      <w:pPr>
+        <w:spacing w:after="0" w:line="240" w:lineRule="auto"/>
+      </w:pPr>
+      <w:r>
+        <w:separator/>
+      </w:r>
+    </w:p>
+  </w:footnote>
+  <w:footnote w:type="continuationSeparator" w:id="0">
+    <w:p>
+      <w:pPr>
+        <w:spacing w:after="0" w:line="240" w:lineRule="auto"/>
+      </w:pPr>
+      <w:r>
+        <w:continuationSeparator/>
+      </w:r>
+    </w:p>
+  </w:footnote>
+</w:footnotes>
+</file>
+
+<file path=word/numbering.xml><?xml version="1.0" encoding="utf-8"?>
+<w:numbering xmlns:wpc="http://schemas.microsoft.com/office/word/2010/wordprocessingCanvas" xmlns:cx="http://schemas.microsoft.com/office/drawing/2014/chartex" xmlns:cx1="http://schemas.microsoft.com/office/drawing/2015/9/8/chartex" xmlns:cx2="http://schemas.microsoft.com/office/drawing/2015/10/21/chartex" xmlns:cx3="http://schemas.microsoft.com/office/drawing/2016/5/9/chartex" xmlns:cx4="http://schemas.microsoft.com/office/drawing/2016/5/10/chartex" xmlns:cx5="http://schemas.microsoft.com/office/drawing/2016/5/11/chartex" xmlns:cx6="http://schemas.microsoft.com/office/drawing/2016/5/12/chartex" xmlns:cx7="http://schemas.microsoft.com/office/drawing/2016/5/13/chartex" xmlns:cx8="http://schemas.microsoft.com/office/drawing/2016/5/14/chartex" xmlns:mc="http://schemas.openxmlformats.org/markup-compatibility/2006" xmlns:aink="http://schemas.microsoft.com/office/drawing/2016/ink" xmlns:am3d="http://schemas.microsoft.com/office/drawing/2017/model3d" xmlns:o="urn:schemas-microsoft-com:office:office" xmlns:oel="http://schemas.microsoft.com/office/2019/extlst" xmlns:r="http://schemas.openxmlformats.org/officeDocument/2006/relationships" xmlns:m="http://schemas.openxmlformats.org/officeDocument/2006/math" xmlns:v="urn:schemas-microsoft-com:vml" xmlns:wp14="http://schemas.microsoft.com/office/word/2010/wordprocessingDrawing" xmlns:wp="http://schemas.openxmlformats.org/drawingml/2006/wordprocessingDrawing" xmlns:w10="urn:schemas-microsoft-com:office:word" xmlns:w="http://schemas.openxmlformats.org/wordprocessingml/2006/main" xmlns:w14="http://schemas.microsoft.com/office/word/2010/wordml" xmlns:w15="http://schemas.microsoft.com/office/word/2012/wordml" xmlns:w16cex="http://schemas.microsoft.com/office/word/2018/wordml/cex" xmlns:w16cid="http://schemas.microsoft.com/office/word/2016/wordml/cid" xmlns:w16="http://schemas.microsoft.com/office/word/2018/wordml" xmlns:w16du="http://schemas.microsoft.com/office/word/2023/wordml/word16du" xmlns:w16sdtdh="http://schemas.microsoft.com/office/word/2020/wordml/sdtdatahash" xmlns:w16sdtfl="http://schemas.microsoft.com/office/word/2024/wordml/sdtformatlock" xmlns:w16se="http://schemas.microsoft.com/office/word/2015/wordml/symex" xmlns:wpg="http://schemas.microsoft.com/office/word/2010/wordprocessingGroup" xmlns:wpi="http://schemas.microsoft.com/office/word/2010/wordprocessingInk" xmlns:wne="http://schemas.microsoft.com/office/word/2006/wordml" xmlns:wps="http://schemas.microsoft.com/office/word/2010/wordprocessingShape" mc:Ignorable="w14 w15 w16se w16cid w16 w16cex w16sdtdh w16sdtfl w16du wp14">
+  <w:abstractNum w:abstractNumId="0" w15:restartNumberingAfterBreak="0">
+    <w:nsid w:val="270D56AC"/>
+    <w:multiLevelType w:val="hybridMultilevel"/>
+    <w:tmpl w:val="0BFE5A54"/>
+    <w:lvl w:ilvl="0" w:tplc="AD064142">
+      <w:start w:val="1"/>
+      <w:numFmt w:val="decimal"/>
+      <w:lvlText w:val="%1."/>
+      <w:lvlJc w:val="left"/>
+      <w:pPr>
+        <w:ind w:left="1068" w:hanging="360"/>
+      </w:pPr>
+      <w:rPr>
+        <w:rFonts w:hint="default"/>
+      </w:rPr>
+    </w:lvl>
+    <w:lvl w:ilvl="1" w:tplc="0C0A0019" w:tentative="1">
+      <w:start w:val="1"/>
+      <w:numFmt w:val="lowerLetter"/>
+      <w:lvlText w:val="%2."/>
+      <w:lvlJc w:val="left"/>
+      <w:pPr>
+        <w:ind w:left="1788" w:hanging="360"/>
+      </w:pPr>
+    </w:lvl>
+    <w:lvl w:ilvl="2" w:tplc="0C0A001B" w:tentative="1">
+      <w:start w:val="1"/>
+      <w:numFmt w:val="lowerRoman"/>
+      <w:lvlText w:val="%3."/>
+      <w:lvlJc w:val="right"/>
+      <w:pPr>
+        <w:ind w:left="2508" w:hanging="180"/>
+      </w:pPr>
+    </w:lvl>
+    <w:lvl w:ilvl="3" w:tplc="0C0A000F" w:tentative="1">
+      <w:start w:val="1"/>
+      <w:numFmt w:val="decimal"/>
+      <w:lvlText w:val="%4."/>
+      <w:lvlJc w:val="left"/>
+      <w:pPr>
+        <w:ind w:left="3228" w:hanging="360"/>
+      </w:pPr>
+    </w:lvl>
+    <w:lvl w:ilvl="4" w:tplc="0C0A0019" w:tentative="1">
+      <w:start w:val="1"/>
+      <w:numFmt w:val="lowerLetter"/>
+      <w:lvlText w:val="%5."/>
+      <w:lvlJc w:val="left"/>
+      <w:pPr>
+        <w:ind w:left="3948" w:hanging="360"/>
+      </w:pPr>
+    </w:lvl>
+    <w:lvl w:ilvl="5" w:tplc="0C0A001B" w:tentative="1">
+      <w:start w:val="1"/>
+      <w:numFmt w:val="lowerRoman"/>
+      <w:lvlText w:val="%6."/>
+      <w:lvlJc w:val="right"/>
+      <w:pPr>
+        <w:ind w:left="4668" w:hanging="180"/>
+      </w:pPr>
+    </w:lvl>
+    <w:lvl w:ilvl="6" w:tplc="0C0A000F" w:tentative="1">
+      <w:start w:val="1"/>
+      <w:numFmt w:val="decimal"/>
+      <w:lvlText w:val="%7."/>
+      <w:lvlJc w:val="left"/>
+      <w:pPr>
+        <w:ind w:left="5388" w:hanging="360"/>
+      </w:pPr>
+    </w:lvl>
+    <w:lvl w:ilvl="7" w:tplc="0C0A0019" w:tentative="1">
+      <w:start w:val="1"/>
+      <w:numFmt w:val="lowerLetter"/>
+      <w:lvlText w:val="%8."/>
+      <w:lvlJc w:val="left"/>
+      <w:pPr>
+        <w:ind w:left="6108" w:hanging="360"/>
+      </w:pPr>
+    </w:lvl>
+    <w:lvl w:ilvl="8" w:tplc="0C0A001B" w:tentative="1">
+      <w:start w:val="1"/>
+      <w:numFmt w:val="lowerRoman"/>
+      <w:lvlText w:val="%9."/>
+      <w:lvlJc w:val="right"/>
+      <w:pPr>
+        <w:ind w:left="6828" w:hanging="180"/>
+      </w:pPr>
+    </w:lvl>
+  </w:abstractNum>
+  <w:abstractNum w:abstractNumId="1" w15:restartNumberingAfterBreak="0">
+    <w:nsid w:val="326E5B0B"/>
+    <w:multiLevelType w:val="hybridMultilevel"/>
+    <w:tmpl w:val="5F8A8FF2"/>
+    <w:lvl w:ilvl="0" w:tplc="0C0A000F">
+      <w:start w:val="1"/>
+      <w:numFmt w:val="decimal"/>
+      <w:lvlText w:val="%1."/>
+      <w:lvlJc w:val="left"/>
+      <w:pPr>
+        <w:ind w:left="720" w:hanging="360"/>
+      </w:pPr>
+      <w:rPr>
+        <w:rFonts w:hint="default"/>
+      </w:rPr>
+    </w:lvl>
+    <w:lvl w:ilvl="1" w:tplc="0C0A0019" w:tentative="1">
+      <w:start w:val="1"/>
+      <w:numFmt w:val="lowerLetter"/>
+      <w:lvlText w:val="%2."/>
+      <w:lvlJc w:val="left"/>
+      <w:pPr>
+        <w:ind w:left="1440" w:hanging="360"/>
+      </w:pPr>
+    </w:lvl>
+    <w:lvl w:ilvl="2" w:tplc="0C0A001B" w:tentative="1">
+      <w:start w:val="1"/>
+      <w:numFmt w:val="lowerRoman"/>
+      <w:lvlText w:val="%3."/>
+      <w:lvlJc w:val="right"/>
+      <w:pPr>
+        <w:ind w:left="2160" w:hanging="180"/>
+      </w:pPr>
+    </w:lvl>
+    <w:lvl w:ilvl="3" w:tplc="0C0A000F" w:tentative="1">
+      <w:start w:val="1"/>
+      <w:numFmt w:val="decimal"/>
+      <w:lvlText w:val="%4."/>
+      <w:lvlJc w:val="left"/>
+      <w:pPr>
+        <w:ind w:left="2880" w:hanging="360"/>
+      </w:pPr>
+    </w:lvl>
+    <w:lvl w:ilvl="4" w:tplc="0C0A0019" w:tentative="1">
+      <w:start w:val="1"/>
+      <w:numFmt w:val="lowerLetter"/>
+      <w:lvlText w:val="%5."/>
+      <w:lvlJc w:val="left"/>
+      <w:pPr>
+        <w:ind w:left="3600" w:hanging="360"/>
+      </w:pPr>
+    </w:lvl>
+    <w:lvl w:ilvl="5" w:tplc="0C0A001B" w:tentative="1">
+      <w:start w:val="1"/>
+      <w:numFmt w:val="lowerRoman"/>
+      <w:lvlText w:val="%6."/>
+      <w:lvlJc w:val="right"/>
+      <w:pPr>
+        <w:ind w:left="4320" w:hanging="180"/>
+      </w:pPr>
+    </w:lvl>
+    <w:lvl w:ilvl="6" w:tplc="0C0A000F" w:tentative="1">
+      <w:start w:val="1"/>
+      <w:numFmt w:val="decimal"/>
+      <w:lvlText w:val="%7."/>
+      <w:lvlJc w:val="left"/>
+      <w:pPr>
+        <w:ind w:left="5040" w:hanging="360"/>
+      </w:pPr>
+    </w:lvl>
+    <w:lvl w:ilvl="7" w:tplc="0C0A0019" w:tentative="1">
+      <w:start w:val="1"/>
+      <w:numFmt w:val="lowerLetter"/>
+      <w:lvlText w:val="%8."/>
+      <w:lvlJc w:val="left"/>
+      <w:pPr>
+        <w:ind w:left="5760" w:hanging="360"/>
+      </w:pPr>
+    </w:lvl>
+    <w:lvl w:ilvl="8" w:tplc="0C0A001B" w:tentative="1">
+      <w:start w:val="1"/>
+      <w:numFmt w:val="lowerRoman"/>
+      <w:lvlText w:val="%9."/>
+      <w:lvlJc w:val="right"/>
+      <w:pPr>
+        <w:ind w:left="6480" w:hanging="180"/>
+      </w:pPr>
+    </w:lvl>
+  </w:abstractNum>
+  <w:abstractNum w:abstractNumId="2" w15:restartNumberingAfterBreak="0">
+    <w:nsid w:val="54977DD0"/>
+    <w:multiLevelType w:val="hybridMultilevel"/>
+    <w:tmpl w:val="3B4C4958"/>
+    <w:lvl w:ilvl="0" w:tplc="43EE50DA">
+      <w:start w:val="1"/>
+      <w:numFmt w:val="decimal"/>
+      <w:lvlText w:val="%1."/>
+      <w:lvlJc w:val="left"/>
+      <w:pPr>
+        <w:ind w:left="720" w:hanging="360"/>
+      </w:pPr>
+      <w:rPr>
+        <w:rFonts w:asciiTheme="majorHAnsi" w:eastAsiaTheme="majorEastAsia" w:hAnsiTheme="majorHAnsi" w:cstheme="majorBidi"/>
+      </w:rPr>
+    </w:lvl>
+    <w:lvl w:ilvl="1" w:tplc="0C0A0019" w:tentative="1">
+      <w:start w:val="1"/>
+      <w:numFmt w:val="lowerLetter"/>
+      <w:lvlText w:val="%2."/>
+      <w:lvlJc w:val="left"/>
+      <w:pPr>
+        <w:ind w:left="1440" w:hanging="360"/>
+      </w:pPr>
+    </w:lvl>
+    <w:lvl w:ilvl="2" w:tplc="0C0A001B" w:tentative="1">
+      <w:start w:val="1"/>
+      <w:numFmt w:val="lowerRoman"/>
+      <w:lvlText w:val="%3."/>
+      <w:lvlJc w:val="right"/>
+      <w:pPr>
+        <w:ind w:left="2160" w:hanging="180"/>
+      </w:pPr>
+    </w:lvl>
+    <w:lvl w:ilvl="3" w:tplc="0C0A000F" w:tentative="1">
+      <w:start w:val="1"/>
+      <w:numFmt w:val="decimal"/>
+      <w:lvlText w:val="%4."/>
+      <w:lvlJc w:val="left"/>
+      <w:pPr>
+        <w:ind w:left="2880" w:hanging="360"/>
+      </w:pPr>
+    </w:lvl>
+    <w:lvl w:ilvl="4" w:tplc="0C0A0019" w:tentative="1">
+      <w:start w:val="1"/>
+      <w:numFmt w:val="lowerLetter"/>
+      <w:lvlText w:val="%5."/>
+      <w:lvlJc w:val="left"/>
+      <w:pPr>
+        <w:ind w:left="3600" w:hanging="360"/>
+      </w:pPr>
+    </w:lvl>
+    <w:lvl w:ilvl="5" w:tplc="0C0A001B" w:tentative="1">
+      <w:start w:val="1"/>
+      <w:numFmt w:val="lowerRoman"/>
+      <w:lvlText w:val="%6."/>
+      <w:lvlJc w:val="right"/>
+      <w:pPr>
+        <w:ind w:left="4320" w:hanging="180"/>
+      </w:pPr>
+    </w:lvl>
+    <w:lvl w:ilvl="6" w:tplc="0C0A000F" w:tentative="1">
+      <w:start w:val="1"/>
+      <w:numFmt w:val="decimal"/>
+      <w:lvlText w:val="%7."/>
+      <w:lvlJc w:val="left"/>
+      <w:pPr>
+        <w:ind w:left="5040" w:hanging="360"/>
+      </w:pPr>
+    </w:lvl>
+    <w:lvl w:ilvl="7" w:tplc="0C0A0019" w:tentative="1">
+      <w:start w:val="1"/>
+      <w:numFmt w:val="lowerLetter"/>
+      <w:lvlText w:val="%8."/>
+      <w:lvlJc w:val="left"/>
+      <w:pPr>
+        <w:ind w:left="5760" w:hanging="360"/>
+      </w:pPr>
+    </w:lvl>
+    <w:lvl w:ilvl="8" w:tplc="0C0A001B" w:tentative="1">
+      <w:start w:val="1"/>
+      <w:numFmt w:val="lowerRoman"/>
+      <w:lvlText w:val="%9."/>
+      <w:lvlJc w:val="right"/>
+      <w:pPr>
+        <w:ind w:left="6480" w:hanging="180"/>
+      </w:pPr>
+    </w:lvl>
+  </w:abstractNum>
+  <w:abstractNum w:abstractNumId="3" w15:restartNumberingAfterBreak="0">
+    <w:nsid w:val="54B022D1"/>
+    <w:multiLevelType w:val="hybridMultilevel"/>
+    <w:tmpl w:val="869EEBE4"/>
+    <w:lvl w:ilvl="0" w:tplc="0C0A000F">
+      <w:start w:val="1"/>
+      <w:numFmt w:val="decimal"/>
+      <w:lvlText w:val="%1."/>
+      <w:lvlJc w:val="left"/>
+      <w:pPr>
+        <w:ind w:left="720" w:hanging="360"/>
+      </w:pPr>
+      <w:rPr>
+        <w:rFonts w:hint="default"/>
+      </w:rPr>
+    </w:lvl>
+    <w:lvl w:ilvl="1" w:tplc="0C0A0019" w:tentative="1">
+      <w:start w:val="1"/>
+      <w:numFmt w:val="lowerLetter"/>
+      <w:lvlText w:val="%2."/>
+      <w:lvlJc w:val="left"/>
+      <w:pPr>
+        <w:ind w:left="1440" w:hanging="360"/>
+      </w:pPr>
+    </w:lvl>
+    <w:lvl w:ilvl="2" w:tplc="0C0A001B" w:tentative="1">
+      <w:start w:val="1"/>
+      <w:numFmt w:val="lowerRoman"/>
+      <w:lvlText w:val="%3."/>
+      <w:lvlJc w:val="right"/>
+      <w:pPr>
+        <w:ind w:left="2160" w:hanging="180"/>
+      </w:pPr>
+    </w:lvl>
+    <w:lvl w:ilvl="3" w:tplc="0C0A000F" w:tentative="1">
+      <w:start w:val="1"/>
+      <w:numFmt w:val="decimal"/>
+      <w:lvlText w:val="%4."/>
+      <w:lvlJc w:val="left"/>
+      <w:pPr>
+        <w:ind w:left="2880" w:hanging="360"/>
+      </w:pPr>
+    </w:lvl>
+    <w:lvl w:ilvl="4" w:tplc="0C0A0019" w:tentative="1">
+      <w:start w:val="1"/>
+      <w:numFmt w:val="lowerLetter"/>
+      <w:lvlText w:val="%5."/>
+      <w:lvlJc w:val="left"/>
+      <w:pPr>
+        <w:ind w:left="3600" w:hanging="360"/>
+      </w:pPr>
+    </w:lvl>
+    <w:lvl w:ilvl="5" w:tplc="0C0A001B" w:tentative="1">
+      <w:start w:val="1"/>
+      <w:numFmt w:val="lowerRoman"/>
+      <w:lvlText w:val="%6."/>
+      <w:lvlJc w:val="right"/>
+      <w:pPr>
+        <w:ind w:left="4320" w:hanging="180"/>
+      </w:pPr>
+    </w:lvl>
+    <w:lvl w:ilvl="6" w:tplc="0C0A000F" w:tentative="1">
+      <w:start w:val="1"/>
+      <w:numFmt w:val="decimal"/>
+      <w:lvlText w:val="%7."/>
+      <w:lvlJc w:val="left"/>
+      <w:pPr>
+        <w:ind w:left="5040" w:hanging="360"/>
+      </w:pPr>
+    </w:lvl>
+    <w:lvl w:ilvl="7" w:tplc="0C0A0019" w:tentative="1">
+      <w:start w:val="1"/>
+      <w:numFmt w:val="lowerLetter"/>
+      <w:lvlText w:val="%8."/>
+      <w:lvlJc w:val="left"/>
+      <w:pPr>
+        <w:ind w:left="5760" w:hanging="360"/>
+      </w:pPr>
+    </w:lvl>
+    <w:lvl w:ilvl="8" w:tplc="0C0A001B" w:tentative="1">
+      <w:start w:val="1"/>
+      <w:numFmt w:val="lowerRoman"/>
+      <w:lvlText w:val="%9."/>
+      <w:lvlJc w:val="right"/>
+      <w:pPr>
+        <w:ind w:left="6480" w:hanging="180"/>
+      </w:pPr>
+    </w:lvl>
+  </w:abstractNum>
+  <w:abstractNum w:abstractNumId="4" w15:restartNumberingAfterBreak="0">
+    <w:nsid w:val="63113F4B"/>
+    <w:multiLevelType w:val="hybridMultilevel"/>
+    <w:tmpl w:val="13BC6132"/>
+    <w:lvl w:ilvl="0" w:tplc="0C0A000F">
+      <w:start w:val="1"/>
+      <w:numFmt w:val="decimal"/>
+      <w:lvlText w:val="%1."/>
+      <w:lvlJc w:val="left"/>
+      <w:pPr>
+        <w:ind w:left="720" w:hanging="360"/>
+      </w:pPr>
+      <w:rPr>
+        <w:rFonts w:hint="default"/>
+      </w:rPr>
+    </w:lvl>
+    <w:lvl w:ilvl="1" w:tplc="0C0A0019" w:tentative="1">
+      <w:start w:val="1"/>
+      <w:numFmt w:val="lowerLetter"/>
+      <w:lvlText w:val="%2."/>
+      <w:lvlJc w:val="left"/>
+      <w:pPr>
+        <w:ind w:left="1440" w:hanging="360"/>
+      </w:pPr>
+    </w:lvl>
+    <w:lvl w:ilvl="2" w:tplc="0C0A001B" w:tentative="1">
+      <w:start w:val="1"/>
+      <w:numFmt w:val="lowerRoman"/>
+      <w:lvlText w:val="%3."/>
+      <w:lvlJc w:val="right"/>
+      <w:pPr>
+        <w:ind w:left="2160" w:hanging="180"/>
+      </w:pPr>
+    </w:lvl>
+    <w:lvl w:ilvl="3" w:tplc="0C0A000F" w:tentative="1">
+      <w:start w:val="1"/>
+      <w:numFmt w:val="decimal"/>
+      <w:lvlText w:val="%4."/>
+      <w:lvlJc w:val="left"/>
+      <w:pPr>
+        <w:ind w:left="2880" w:hanging="360"/>
+      </w:pPr>
+    </w:lvl>
+    <w:lvl w:ilvl="4" w:tplc="0C0A0019" w:tentative="1">
+      <w:start w:val="1"/>
+      <w:numFmt w:val="lowerLetter"/>
+      <w:lvlText w:val="%5."/>
+      <w:lvlJc w:val="left"/>
+      <w:pPr>
+        <w:ind w:left="3600" w:hanging="360"/>
+      </w:pPr>
+    </w:lvl>
+    <w:lvl w:ilvl="5" w:tplc="0C0A001B" w:tentative="1">
+      <w:start w:val="1"/>
+      <w:numFmt w:val="lowerRoman"/>
+      <w:lvlText w:val="%6."/>
+      <w:lvlJc w:val="right"/>
+      <w:pPr>
+        <w:ind w:left="4320" w:hanging="180"/>
+      </w:pPr>
+    </w:lvl>
+    <w:lvl w:ilvl="6" w:tplc="0C0A000F" w:tentative="1">
+      <w:start w:val="1"/>
+      <w:numFmt w:val="decimal"/>
+      <w:lvlText w:val="%7."/>
+      <w:lvlJc w:val="left"/>
+      <w:pPr>
+        <w:ind w:left="5040" w:hanging="360"/>
+      </w:pPr>
+    </w:lvl>
+    <w:lvl w:ilvl="7" w:tplc="0C0A0019" w:tentative="1">
+      <w:start w:val="1"/>
+      <w:numFmt w:val="lowerLetter"/>
+      <w:lvlText w:val="%8."/>
+      <w:lvlJc w:val="left"/>
+      <w:pPr>
+        <w:ind w:left="5760" w:hanging="360"/>
+      </w:pPr>
+    </w:lvl>
+    <w:lvl w:ilvl="8" w:tplc="0C0A001B" w:tentative="1">
+      <w:start w:val="1"/>
+      <w:numFmt w:val="lowerRoman"/>
+      <w:lvlText w:val="%9."/>
+      <w:lvlJc w:val="right"/>
+      <w:pPr>
+        <w:ind w:left="6480" w:hanging="180"/>
+      </w:pPr>
+    </w:lvl>
+  </w:abstractNum>
+  <w:abstractNum w:abstractNumId="5" w15:restartNumberingAfterBreak="0">
+    <w:nsid w:val="7B22239A"/>
+    <w:multiLevelType w:val="hybridMultilevel"/>
+    <w:tmpl w:val="FDF2D792"/>
+    <w:lvl w:ilvl="0" w:tplc="FFFFFFFF">
+      <w:start w:val="1"/>
+      <w:numFmt w:val="decimal"/>
+      <w:lvlText w:val="%1"/>
+      <w:lvlJc w:val="left"/>
+      <w:pPr>
+        <w:ind w:left="720" w:hanging="360"/>
+      </w:pPr>
+      <w:rPr>
+        <w:rFonts w:asciiTheme="majorHAnsi" w:eastAsiaTheme="majorEastAsia" w:hAnsiTheme="majorHAnsi" w:cstheme="majorBidi"/>
+      </w:rPr>
+    </w:lvl>
+    <w:lvl w:ilvl="1" w:tplc="FFFFFFFF" w:tentative="1">
+      <w:start w:val="1"/>
+      <w:numFmt w:val="lowerLetter"/>
+      <w:lvlText w:val="%2."/>
+      <w:lvlJc w:val="left"/>
+      <w:pPr>
+        <w:ind w:left="1440" w:hanging="360"/>
+      </w:pPr>
+    </w:lvl>
+    <w:lvl w:ilvl="2" w:tplc="FFFFFFFF" w:tentative="1">
+      <w:start w:val="1"/>
+      <w:numFmt w:val="lowerRoman"/>
+      <w:lvlText w:val="%3."/>
+      <w:lvlJc w:val="right"/>
+      <w:pPr>
+        <w:ind w:left="2160" w:hanging="180"/>
+      </w:pPr>
+    </w:lvl>
+    <w:lvl w:ilvl="3" w:tplc="FFFFFFFF" w:tentative="1">
+      <w:start w:val="1"/>
+      <w:numFmt w:val="decimal"/>
+      <w:lvlText w:val="%4."/>
+      <w:lvlJc w:val="left"/>
+      <w:pPr>
+        <w:ind w:left="2880" w:hanging="360"/>
+      </w:pPr>
+    </w:lvl>
+    <w:lvl w:ilvl="4" w:tplc="FFFFFFFF" w:tentative="1">
+      <w:start w:val="1"/>
+      <w:numFmt w:val="lowerLetter"/>
+      <w:lvlText w:val="%5."/>
+      <w:lvlJc w:val="left"/>
+      <w:pPr>
+        <w:ind w:left="3600" w:hanging="360"/>
+      </w:pPr>
+    </w:lvl>
+    <w:lvl w:ilvl="5" w:tplc="FFFFFFFF" w:tentative="1">
+      <w:start w:val="1"/>
+      <w:numFmt w:val="lowerRoman"/>
+      <w:lvlText w:val="%6."/>
+      <w:lvlJc w:val="right"/>
+      <w:pPr>
+        <w:ind w:left="4320" w:hanging="180"/>
+      </w:pPr>
+    </w:lvl>
+    <w:lvl w:ilvl="6" w:tplc="FFFFFFFF" w:tentative="1">
+      <w:start w:val="1"/>
+      <w:numFmt w:val="decimal"/>
+      <w:lvlText w:val="%7."/>
+      <w:lvlJc w:val="left"/>
+      <w:pPr>
+        <w:ind w:left="5040" w:hanging="360"/>
+      </w:pPr>
+    </w:lvl>
+    <w:lvl w:ilvl="7" w:tplc="FFFFFFFF" w:tentative="1">
+      <w:start w:val="1"/>
+      <w:numFmt w:val="lowerLetter"/>
+      <w:lvlText w:val="%8."/>
+      <w:lvlJc w:val="left"/>
+      <w:pPr>
+        <w:ind w:left="5760" w:hanging="360"/>
+      </w:pPr>
+    </w:lvl>
+    <w:lvl w:ilvl="8" w:tplc="FFFFFFFF" w:tentative="1">
+      <w:start w:val="1"/>
+      <w:numFmt w:val="lowerRoman"/>
+      <w:lvlText w:val="%9."/>
+      <w:lvlJc w:val="right"/>
+      <w:pPr>
+        <w:ind w:left="6480" w:hanging="180"/>
+      </w:pPr>
+    </w:lvl>
+  </w:abstractNum>
+  <w:num w:numId="1" w16cid:durableId="210656752">
+    <w:abstractNumId w:val="2"/>
+  </w:num>
+  <w:num w:numId="2" w16cid:durableId="250621765">
+    <w:abstractNumId w:val="5"/>
+  </w:num>
+  <w:num w:numId="3" w16cid:durableId="1735196918">
+    <w:abstractNumId w:val="3"/>
+  </w:num>
+  <w:num w:numId="4" w16cid:durableId="1582332568">
+    <w:abstractNumId w:val="4"/>
+  </w:num>
+  <w:num w:numId="5" w16cid:durableId="97920194">
+    <w:abstractNumId w:val="0"/>
+  </w:num>
+  <w:num w:numId="6" w16cid:durableId="1342858010">
+    <w:abstractNumId w:val="1"/>
+  </w:num>
+</w:numbering>
 </file>
 
 <file path=word/styles.xml><?xml version="1.0" encoding="utf-8"?>
@@ -1096,6 +4439,126 @@
       <w:spacing w:val="5"/>
     </w:rPr>
   </w:style>
+  <w:style w:type="paragraph" w:styleId="Sinespaciado">
+    <w:name w:val="No Spacing"/>
+    <w:link w:val="SinespaciadoCar"/>
+    <w:uiPriority w:val="1"/>
+    <w:qFormat/>
+    <w:rsid w:val="00BA1AB7"/>
+    <w:pPr>
+      <w:spacing w:after="0" w:line="240" w:lineRule="auto"/>
+    </w:pPr>
+    <w:rPr>
+      <w:rFonts w:eastAsiaTheme="minorEastAsia"/>
+      <w:kern w:val="0"/>
+      <w:sz w:val="22"/>
+      <w:szCs w:val="22"/>
+      <w:lang w:eastAsia="es-ES"/>
+      <w14:ligatures w14:val="none"/>
+    </w:rPr>
+  </w:style>
+  <w:style w:type="character" w:customStyle="1" w:styleId="SinespaciadoCar">
+    <w:name w:val="Sin espaciado Car"/>
+    <w:basedOn w:val="Fuentedeprrafopredeter"/>
+    <w:link w:val="Sinespaciado"/>
+    <w:uiPriority w:val="1"/>
+    <w:rsid w:val="00BA1AB7"/>
+    <w:rPr>
+      <w:rFonts w:eastAsiaTheme="minorEastAsia"/>
+      <w:kern w:val="0"/>
+      <w:sz w:val="22"/>
+      <w:szCs w:val="22"/>
+      <w:lang w:eastAsia="es-ES"/>
+      <w14:ligatures w14:val="none"/>
+    </w:rPr>
+  </w:style>
+  <w:style w:type="paragraph" w:styleId="TtuloTDC">
+    <w:name w:val="TOC Heading"/>
+    <w:basedOn w:val="Ttulo1"/>
+    <w:next w:val="Normal"/>
+    <w:uiPriority w:val="39"/>
+    <w:unhideWhenUsed/>
+    <w:qFormat/>
+    <w:rsid w:val="00BA1AB7"/>
+    <w:pPr>
+      <w:spacing w:before="240" w:after="0" w:line="259" w:lineRule="auto"/>
+      <w:outlineLvl w:val="9"/>
+    </w:pPr>
+    <w:rPr>
+      <w:kern w:val="0"/>
+      <w:sz w:val="32"/>
+      <w:szCs w:val="32"/>
+      <w:lang w:eastAsia="es-ES"/>
+      <w14:ligatures w14:val="none"/>
+    </w:rPr>
+  </w:style>
+  <w:style w:type="paragraph" w:styleId="TDC1">
+    <w:name w:val="toc 1"/>
+    <w:basedOn w:val="Normal"/>
+    <w:next w:val="Normal"/>
+    <w:autoRedefine/>
+    <w:uiPriority w:val="39"/>
+    <w:unhideWhenUsed/>
+    <w:rsid w:val="00BA1AB7"/>
+    <w:pPr>
+      <w:spacing w:after="100"/>
+    </w:pPr>
+  </w:style>
+  <w:style w:type="character" w:styleId="Hipervnculo">
+    <w:name w:val="Hyperlink"/>
+    <w:basedOn w:val="Fuentedeprrafopredeter"/>
+    <w:uiPriority w:val="99"/>
+    <w:unhideWhenUsed/>
+    <w:rsid w:val="00BA1AB7"/>
+    <w:rPr>
+      <w:color w:val="467886" w:themeColor="hyperlink"/>
+      <w:u w:val="single"/>
+    </w:rPr>
+  </w:style>
+  <w:style w:type="paragraph" w:styleId="Encabezado">
+    <w:name w:val="header"/>
+    <w:basedOn w:val="Normal"/>
+    <w:link w:val="EncabezadoCar"/>
+    <w:uiPriority w:val="99"/>
+    <w:unhideWhenUsed/>
+    <w:rsid w:val="00744AAF"/>
+    <w:pPr>
+      <w:tabs>
+        <w:tab w:val="center" w:pos="4252"/>
+        <w:tab w:val="right" w:pos="8504"/>
+      </w:tabs>
+      <w:spacing w:after="0" w:line="240" w:lineRule="auto"/>
+    </w:pPr>
+  </w:style>
+  <w:style w:type="character" w:customStyle="1" w:styleId="EncabezadoCar">
+    <w:name w:val="Encabezado Car"/>
+    <w:basedOn w:val="Fuentedeprrafopredeter"/>
+    <w:link w:val="Encabezado"/>
+    <w:uiPriority w:val="99"/>
+    <w:rsid w:val="00744AAF"/>
+  </w:style>
+  <w:style w:type="paragraph" w:styleId="Piedepgina">
+    <w:name w:val="footer"/>
+    <w:basedOn w:val="Normal"/>
+    <w:link w:val="PiedepginaCar"/>
+    <w:uiPriority w:val="99"/>
+    <w:unhideWhenUsed/>
+    <w:rsid w:val="00744AAF"/>
+    <w:pPr>
+      <w:tabs>
+        <w:tab w:val="center" w:pos="4252"/>
+        <w:tab w:val="right" w:pos="8504"/>
+      </w:tabs>
+      <w:spacing w:after="0" w:line="240" w:lineRule="auto"/>
+    </w:pPr>
+  </w:style>
+  <w:style w:type="character" w:customStyle="1" w:styleId="PiedepginaCar">
+    <w:name w:val="Pie de página Car"/>
+    <w:basedOn w:val="Fuentedeprrafopredeter"/>
+    <w:link w:val="Piedepgina"/>
+    <w:uiPriority w:val="99"/>
+    <w:rsid w:val="00744AAF"/>
+  </w:style>
 </w:styles>
 </file>
 
@@ -1392,4 +4855,35 @@
     </a:ext>
   </a:extLst>
 </a:theme>
+</file>
+
+<file path=customXml/item1.xml><?xml version="1.0" encoding="utf-8"?>
+<CoverPageProperties xmlns="http://schemas.microsoft.com/office/2006/coverPageProps">
+  <PublishDate>2026-09-24T00:00:00</PublishDate>
+  <Abstract/>
+  <CompanyAddress/>
+  <CompanyPhone/>
+  <CompanyFax/>
+  <CompanyEmail/>
+</CoverPageProperties>
+</file>
+
+<file path=customXml/item2.xml><?xml version="1.0" encoding="utf-8"?>
+<b:Sources xmlns:b="http://schemas.openxmlformats.org/officeDocument/2006/bibliography" xmlns="http://schemas.openxmlformats.org/officeDocument/2006/bibliography" SelectedStyle="\APASixthEditionOfficeOnline.xsl" StyleName="APA" Version="6"/>
+</file>
+
+<file path=customXml/itemProps1.xml><?xml version="1.0" encoding="utf-8"?>
+<ds:datastoreItem xmlns:ds="http://schemas.openxmlformats.org/officeDocument/2006/customXml" ds:itemID="{55AF091B-3C7A-41E3-B477-F2FDAA23CFDA}">
+  <ds:schemaRefs>
+    <ds:schemaRef ds:uri="http://schemas.microsoft.com/office/2006/coverPageProps"/>
+  </ds:schemaRefs>
+</ds:datastoreItem>
+</file>
+
+<file path=customXml/itemProps2.xml><?xml version="1.0" encoding="utf-8"?>
+<ds:datastoreItem xmlns:ds="http://schemas.openxmlformats.org/officeDocument/2006/customXml" ds:itemID="{C8F262CC-A3B0-4091-A024-05C57D65CF59}">
+  <ds:schemaRefs>
+    <ds:schemaRef ds:uri="http://schemas.openxmlformats.org/officeDocument/2006/bibliography"/>
+  </ds:schemaRefs>
+</ds:datastoreItem>
 </file>
</xml_diff>